<commit_message>
doc: commit regenerated mid-semester report docx with abbreviations table
</commit_message>
<xml_diff>
--- a/mid_semester_report.docx
+++ b/mid_semester_report.docx
@@ -5605,6 +5605,568 @@
         <w:t>6. ABBREVIATIONS</w:t>
       </w:r>
     </w:p>
+    <w:tbl>
+      <w:tblPr>
+        <w:tblW w:type="auto" w:w="0"/>
+        <w:tblLook w:firstColumn="1" w:firstRow="1" w:lastColumn="0" w:lastRow="0" w:noHBand="0" w:noVBand="1" w:val="04A0"/>
+        <w:tblBorders>
+          <w:top w:val="single" w:sz="4" w:space="0" w:color="cbd5e0"/>
+          <w:bottom w:val="single" w:sz="4" w:space="0" w:color="cbd5e0"/>
+          <w:left w:val="single" w:sz="4" w:space="0" w:color="cbd5e0"/>
+          <w:right w:val="single" w:sz="4" w:space="0" w:color="cbd5e0"/>
+          <w:insideH w:val="single" w:sz="4" w:space="0" w:color="cbd5e0"/>
+          <w:insideV w:val="single" w:sz="4" w:space="0" w:color="cbd5e0"/>
+        </w:tblBorders>
+      </w:tblPr>
+      <w:tblGrid>
+        <w:gridCol w:w="4514"/>
+        <w:gridCol w:w="4514"/>
+      </w:tblGrid>
+      <w:tr>
+        <w:tc>
+          <w:tcPr>
+            <w:tcW w:type="dxa" w:w="4514"/>
+            <w:tcMar>
+              <w:top w:w="100" w:type="dxa"/>
+              <w:bottom w:w="100" w:type="dxa"/>
+              <w:left w:w="120" w:type="dxa"/>
+              <w:right w:w="120" w:type="dxa"/>
+            </w:tcMar>
+            <w:shd w:fill="ebf8ff"/>
+          </w:tcPr>
+          <w:p>
+            <w:pPr>
+              <w:jc w:val="center"/>
+            </w:pPr>
+            <w:r>
+              <w:rPr>
+                <w:b/>
+                <w:color w:val="2B6CB0"/>
+                <w:sz w:val="19"/>
+              </w:rPr>
+              <w:t>Abbreviation</w:t>
+            </w:r>
+          </w:p>
+        </w:tc>
+        <w:tc>
+          <w:tcPr>
+            <w:tcW w:type="dxa" w:w="4514"/>
+            <w:tcMar>
+              <w:top w:w="100" w:type="dxa"/>
+              <w:bottom w:w="100" w:type="dxa"/>
+              <w:left w:w="120" w:type="dxa"/>
+              <w:right w:w="120" w:type="dxa"/>
+            </w:tcMar>
+            <w:shd w:fill="ebf8ff"/>
+          </w:tcPr>
+          <w:p>
+            <w:pPr>
+              <w:jc w:val="center"/>
+            </w:pPr>
+            <w:r>
+              <w:rPr>
+                <w:b/>
+                <w:color w:val="2B6CB0"/>
+                <w:sz w:val="19"/>
+              </w:rPr>
+              <w:t>Full Form</w:t>
+            </w:r>
+          </w:p>
+        </w:tc>
+      </w:tr>
+      <w:tr>
+        <w:tc>
+          <w:tcPr>
+            <w:tcW w:type="dxa" w:w="4514"/>
+            <w:tcMar>
+              <w:top w:w="100" w:type="dxa"/>
+              <w:bottom w:w="100" w:type="dxa"/>
+              <w:left w:w="120" w:type="dxa"/>
+              <w:right w:w="120" w:type="dxa"/>
+            </w:tcMar>
+          </w:tcPr>
+          <w:p>
+            <w:r>
+              <w:rPr>
+                <w:sz w:val="18"/>
+              </w:rPr>
+              <w:t>MLA</w:t>
+            </w:r>
+          </w:p>
+        </w:tc>
+        <w:tc>
+          <w:tcPr>
+            <w:tcW w:type="dxa" w:w="4514"/>
+            <w:tcMar>
+              <w:top w:w="100" w:type="dxa"/>
+              <w:bottom w:w="100" w:type="dxa"/>
+              <w:left w:w="120" w:type="dxa"/>
+              <w:right w:w="120" w:type="dxa"/>
+            </w:tcMar>
+          </w:tcPr>
+          <w:p>
+            <w:r>
+              <w:rPr>
+                <w:sz w:val="18"/>
+              </w:rPr>
+              <w:t>Multi-Head Latent Attention</w:t>
+            </w:r>
+          </w:p>
+        </w:tc>
+      </w:tr>
+      <w:tr>
+        <w:tc>
+          <w:tcPr>
+            <w:tcW w:type="dxa" w:w="4514"/>
+            <w:tcMar>
+              <w:top w:w="100" w:type="dxa"/>
+              <w:bottom w:w="100" w:type="dxa"/>
+              <w:left w:w="120" w:type="dxa"/>
+              <w:right w:w="120" w:type="dxa"/>
+            </w:tcMar>
+            <w:shd w:fill="f7fafc"/>
+          </w:tcPr>
+          <w:p>
+            <w:r>
+              <w:rPr>
+                <w:sz w:val="18"/>
+              </w:rPr>
+              <w:t>Fold-CP</w:t>
+            </w:r>
+          </w:p>
+        </w:tc>
+        <w:tc>
+          <w:tcPr>
+            <w:tcW w:type="dxa" w:w="4514"/>
+            <w:tcMar>
+              <w:top w:w="100" w:type="dxa"/>
+              <w:bottom w:w="100" w:type="dxa"/>
+              <w:left w:w="120" w:type="dxa"/>
+              <w:right w:w="120" w:type="dxa"/>
+            </w:tcMar>
+            <w:shd w:fill="f7fafc"/>
+          </w:tcPr>
+          <w:p>
+            <w:r>
+              <w:rPr>
+                <w:sz w:val="18"/>
+              </w:rPr>
+              <w:t>Folding Context Parallelism</w:t>
+            </w:r>
+          </w:p>
+        </w:tc>
+      </w:tr>
+      <w:tr>
+        <w:tc>
+          <w:tcPr>
+            <w:tcW w:type="dxa" w:w="4514"/>
+            <w:tcMar>
+              <w:top w:w="100" w:type="dxa"/>
+              <w:bottom w:w="100" w:type="dxa"/>
+              <w:left w:w="120" w:type="dxa"/>
+              <w:right w:w="120" w:type="dxa"/>
+            </w:tcMar>
+          </w:tcPr>
+          <w:p>
+            <w:r>
+              <w:rPr>
+                <w:sz w:val="18"/>
+              </w:rPr>
+              <w:t>TMU</w:t>
+            </w:r>
+          </w:p>
+        </w:tc>
+        <w:tc>
+          <w:tcPr>
+            <w:tcW w:type="dxa" w:w="4514"/>
+            <w:tcMar>
+              <w:top w:w="100" w:type="dxa"/>
+              <w:bottom w:w="100" w:type="dxa"/>
+              <w:left w:w="120" w:type="dxa"/>
+              <w:right w:w="120" w:type="dxa"/>
+            </w:tcMar>
+          </w:tcPr>
+          <w:p>
+            <w:r>
+              <w:rPr>
+                <w:sz w:val="18"/>
+              </w:rPr>
+              <w:t>Triangular Multiplication Unit</w:t>
+            </w:r>
+          </w:p>
+        </w:tc>
+      </w:tr>
+      <w:tr>
+        <w:tc>
+          <w:tcPr>
+            <w:tcW w:type="dxa" w:w="4514"/>
+            <w:tcMar>
+              <w:top w:w="100" w:type="dxa"/>
+              <w:bottom w:w="100" w:type="dxa"/>
+              <w:left w:w="120" w:type="dxa"/>
+              <w:right w:w="120" w:type="dxa"/>
+            </w:tcMar>
+            <w:shd w:fill="f7fafc"/>
+          </w:tcPr>
+          <w:p>
+            <w:r>
+              <w:rPr>
+                <w:sz w:val="18"/>
+              </w:rPr>
+              <w:t>DPO</w:t>
+            </w:r>
+          </w:p>
+        </w:tc>
+        <w:tc>
+          <w:tcPr>
+            <w:tcW w:type="dxa" w:w="4514"/>
+            <w:tcMar>
+              <w:top w:w="100" w:type="dxa"/>
+              <w:bottom w:w="100" w:type="dxa"/>
+              <w:left w:w="120" w:type="dxa"/>
+              <w:right w:w="120" w:type="dxa"/>
+            </w:tcMar>
+            <w:shd w:fill="f7fafc"/>
+          </w:tcPr>
+          <w:p>
+            <w:r>
+              <w:rPr>
+                <w:sz w:val="18"/>
+              </w:rPr>
+              <w:t>Direct Preference Optimization</w:t>
+            </w:r>
+          </w:p>
+        </w:tc>
+      </w:tr>
+      <w:tr>
+        <w:tc>
+          <w:tcPr>
+            <w:tcW w:type="dxa" w:w="4514"/>
+            <w:tcMar>
+              <w:top w:w="100" w:type="dxa"/>
+              <w:bottom w:w="100" w:type="dxa"/>
+              <w:left w:w="120" w:type="dxa"/>
+              <w:right w:w="120" w:type="dxa"/>
+            </w:tcMar>
+          </w:tcPr>
+          <w:p>
+            <w:r>
+              <w:rPr>
+                <w:sz w:val="18"/>
+              </w:rPr>
+              <w:t>SimPO</w:t>
+            </w:r>
+          </w:p>
+        </w:tc>
+        <w:tc>
+          <w:tcPr>
+            <w:tcW w:type="dxa" w:w="4514"/>
+            <w:tcMar>
+              <w:top w:w="100" w:type="dxa"/>
+              <w:bottom w:w="100" w:type="dxa"/>
+              <w:left w:w="120" w:type="dxa"/>
+              <w:right w:w="120" w:type="dxa"/>
+            </w:tcMar>
+          </w:tcPr>
+          <w:p>
+            <w:r>
+              <w:rPr>
+                <w:sz w:val="18"/>
+              </w:rPr>
+              <w:t>Simple Preference Optimization</w:t>
+            </w:r>
+          </w:p>
+        </w:tc>
+      </w:tr>
+      <w:tr>
+        <w:tc>
+          <w:tcPr>
+            <w:tcW w:type="dxa" w:w="4514"/>
+            <w:tcMar>
+              <w:top w:w="100" w:type="dxa"/>
+              <w:bottom w:w="100" w:type="dxa"/>
+              <w:left w:w="120" w:type="dxa"/>
+              <w:right w:w="120" w:type="dxa"/>
+            </w:tcMar>
+            <w:shd w:fill="f7fafc"/>
+          </w:tcPr>
+          <w:p>
+            <w:r>
+              <w:rPr>
+                <w:sz w:val="18"/>
+              </w:rPr>
+              <w:t>VRAM</w:t>
+            </w:r>
+          </w:p>
+        </w:tc>
+        <w:tc>
+          <w:tcPr>
+            <w:tcW w:type="dxa" w:w="4514"/>
+            <w:tcMar>
+              <w:top w:w="100" w:type="dxa"/>
+              <w:bottom w:w="100" w:type="dxa"/>
+              <w:left w:w="120" w:type="dxa"/>
+              <w:right w:w="120" w:type="dxa"/>
+            </w:tcMar>
+            <w:shd w:fill="f7fafc"/>
+          </w:tcPr>
+          <w:p>
+            <w:r>
+              <w:rPr>
+                <w:sz w:val="18"/>
+              </w:rPr>
+              <w:t>Video Random Access Memory</w:t>
+            </w:r>
+          </w:p>
+        </w:tc>
+      </w:tr>
+      <w:tr>
+        <w:tc>
+          <w:tcPr>
+            <w:tcW w:type="dxa" w:w="4514"/>
+            <w:tcMar>
+              <w:top w:w="100" w:type="dxa"/>
+              <w:bottom w:w="100" w:type="dxa"/>
+              <w:left w:w="120" w:type="dxa"/>
+              <w:right w:w="120" w:type="dxa"/>
+            </w:tcMar>
+          </w:tcPr>
+          <w:p>
+            <w:r>
+              <w:rPr>
+                <w:sz w:val="18"/>
+              </w:rPr>
+              <w:t>PDB</w:t>
+            </w:r>
+          </w:p>
+        </w:tc>
+        <w:tc>
+          <w:tcPr>
+            <w:tcW w:type="dxa" w:w="4514"/>
+            <w:tcMar>
+              <w:top w:w="100" w:type="dxa"/>
+              <w:bottom w:w="100" w:type="dxa"/>
+              <w:left w:w="120" w:type="dxa"/>
+              <w:right w:w="120" w:type="dxa"/>
+            </w:tcMar>
+          </w:tcPr>
+          <w:p>
+            <w:r>
+              <w:rPr>
+                <w:sz w:val="18"/>
+              </w:rPr>
+              <w:t>Protein Data Bank</w:t>
+            </w:r>
+          </w:p>
+        </w:tc>
+      </w:tr>
+      <w:tr>
+        <w:tc>
+          <w:tcPr>
+            <w:tcW w:type="dxa" w:w="4514"/>
+            <w:tcMar>
+              <w:top w:w="100" w:type="dxa"/>
+              <w:bottom w:w="100" w:type="dxa"/>
+              <w:left w:w="120" w:type="dxa"/>
+              <w:right w:w="120" w:type="dxa"/>
+            </w:tcMar>
+            <w:shd w:fill="f7fafc"/>
+          </w:tcPr>
+          <w:p>
+            <w:r>
+              <w:rPr>
+                <w:sz w:val="18"/>
+              </w:rPr>
+              <w:t>CIF</w:t>
+            </w:r>
+          </w:p>
+        </w:tc>
+        <w:tc>
+          <w:tcPr>
+            <w:tcW w:type="dxa" w:w="4514"/>
+            <w:tcMar>
+              <w:top w:w="100" w:type="dxa"/>
+              <w:bottom w:w="100" w:type="dxa"/>
+              <w:left w:w="120" w:type="dxa"/>
+              <w:right w:w="120" w:type="dxa"/>
+            </w:tcMar>
+            <w:shd w:fill="f7fafc"/>
+          </w:tcPr>
+          <w:p>
+            <w:r>
+              <w:rPr>
+                <w:sz w:val="18"/>
+              </w:rPr>
+              <w:t>Crystallographic Information File</w:t>
+            </w:r>
+          </w:p>
+        </w:tc>
+      </w:tr>
+      <w:tr>
+        <w:tc>
+          <w:tcPr>
+            <w:tcW w:type="dxa" w:w="4514"/>
+            <w:tcMar>
+              <w:top w:w="100" w:type="dxa"/>
+              <w:bottom w:w="100" w:type="dxa"/>
+              <w:left w:w="120" w:type="dxa"/>
+              <w:right w:w="120" w:type="dxa"/>
+            </w:tcMar>
+          </w:tcPr>
+          <w:p>
+            <w:r>
+              <w:rPr>
+                <w:sz w:val="18"/>
+              </w:rPr>
+              <w:t>ODE</w:t>
+            </w:r>
+          </w:p>
+        </w:tc>
+        <w:tc>
+          <w:tcPr>
+            <w:tcW w:type="dxa" w:w="4514"/>
+            <w:tcMar>
+              <w:top w:w="100" w:type="dxa"/>
+              <w:bottom w:w="100" w:type="dxa"/>
+              <w:left w:w="120" w:type="dxa"/>
+              <w:right w:w="120" w:type="dxa"/>
+            </w:tcMar>
+          </w:tcPr>
+          <w:p>
+            <w:r>
+              <w:rPr>
+                <w:sz w:val="18"/>
+              </w:rPr>
+              <w:t>Ordinary Differential Equation</w:t>
+            </w:r>
+          </w:p>
+        </w:tc>
+      </w:tr>
+      <w:tr>
+        <w:tc>
+          <w:tcPr>
+            <w:tcW w:type="dxa" w:w="4514"/>
+            <w:tcMar>
+              <w:top w:w="100" w:type="dxa"/>
+              <w:bottom w:w="100" w:type="dxa"/>
+              <w:left w:w="120" w:type="dxa"/>
+              <w:right w:w="120" w:type="dxa"/>
+            </w:tcMar>
+            <w:shd w:fill="f7fafc"/>
+          </w:tcPr>
+          <w:p>
+            <w:r>
+              <w:rPr>
+                <w:sz w:val="18"/>
+              </w:rPr>
+              <w:t>pLDDT</w:t>
+            </w:r>
+          </w:p>
+        </w:tc>
+        <w:tc>
+          <w:tcPr>
+            <w:tcW w:type="dxa" w:w="4514"/>
+            <w:tcMar>
+              <w:top w:w="100" w:type="dxa"/>
+              <w:bottom w:w="100" w:type="dxa"/>
+              <w:left w:w="120" w:type="dxa"/>
+              <w:right w:w="120" w:type="dxa"/>
+            </w:tcMar>
+            <w:shd w:fill="f7fafc"/>
+          </w:tcPr>
+          <w:p>
+            <w:r>
+              <w:rPr>
+                <w:sz w:val="18"/>
+              </w:rPr>
+              <w:t>Predicted Local Distance Difference Test</w:t>
+            </w:r>
+          </w:p>
+        </w:tc>
+      </w:tr>
+      <w:tr>
+        <w:tc>
+          <w:tcPr>
+            <w:tcW w:type="dxa" w:w="4514"/>
+            <w:tcMar>
+              <w:top w:w="100" w:type="dxa"/>
+              <w:bottom w:w="100" w:type="dxa"/>
+              <w:left w:w="120" w:type="dxa"/>
+              <w:right w:w="120" w:type="dxa"/>
+            </w:tcMar>
+          </w:tcPr>
+          <w:p>
+            <w:r>
+              <w:rPr>
+                <w:sz w:val="18"/>
+              </w:rPr>
+              <w:t>TM-score</w:t>
+            </w:r>
+          </w:p>
+        </w:tc>
+        <w:tc>
+          <w:tcPr>
+            <w:tcW w:type="dxa" w:w="4514"/>
+            <w:tcMar>
+              <w:top w:w="100" w:type="dxa"/>
+              <w:bottom w:w="100" w:type="dxa"/>
+              <w:left w:w="120" w:type="dxa"/>
+              <w:right w:w="120" w:type="dxa"/>
+            </w:tcMar>
+          </w:tcPr>
+          <w:p>
+            <w:r>
+              <w:rPr>
+                <w:sz w:val="18"/>
+              </w:rPr>
+              <w:t>Template Modeling Score</w:t>
+            </w:r>
+          </w:p>
+        </w:tc>
+      </w:tr>
+      <w:tr>
+        <w:tc>
+          <w:tcPr>
+            <w:tcW w:type="dxa" w:w="4514"/>
+            <w:tcMar>
+              <w:top w:w="100" w:type="dxa"/>
+              <w:bottom w:w="100" w:type="dxa"/>
+              <w:left w:w="120" w:type="dxa"/>
+              <w:right w:w="120" w:type="dxa"/>
+            </w:tcMar>
+            <w:shd w:fill="f7fafc"/>
+          </w:tcPr>
+          <w:p>
+            <w:r>
+              <w:rPr>
+                <w:sz w:val="18"/>
+              </w:rPr>
+              <w:t>RMSD</w:t>
+            </w:r>
+          </w:p>
+        </w:tc>
+        <w:tc>
+          <w:tcPr>
+            <w:tcW w:type="dxa" w:w="4514"/>
+            <w:tcMar>
+              <w:top w:w="100" w:type="dxa"/>
+              <w:bottom w:w="100" w:type="dxa"/>
+              <w:left w:w="120" w:type="dxa"/>
+              <w:right w:w="120" w:type="dxa"/>
+            </w:tcMar>
+            <w:shd w:fill="f7fafc"/>
+          </w:tcPr>
+          <w:p>
+            <w:r>
+              <w:rPr>
+                <w:sz w:val="18"/>
+              </w:rPr>
+              <w:t>Root Mean Square Deviation</w:t>
+            </w:r>
+          </w:p>
+        </w:tc>
+      </w:tr>
+    </w:tbl>
     <w:sectPr>
       <w:pgSz w:w="11909" w:h="16834"/>
       <w:pgMar w:top="1440" w:right="1440" w:bottom="1440" w:left="1440" w:header="720" w:footer="720" w:gutter="0"/>

</xml_diff>

<commit_message>
feat: implement adaptive lookahead, biophysical constraints in speculative flow matching, bidirectional co-design, and QAT tests
</commit_message>
<xml_diff>
--- a/mid_semester_report.docx
+++ b/mid_semester_report.docx
@@ -268,7 +268,16 @@
         <w:jc w:val="both"/>
       </w:pPr>
       <w:r>
-        <w:t>This dissertation addresses the high computational cost and GPU latency of generating large-scale, all-atom biomolecular binders by adapting LLM efficiency techniques—specifically speculative decoding and Group-based Direct Preference Optimization (g-DPO)—to 3D coordinate flow matching and diffusion models.</w:t>
+        <w:t xml:space="preserve">This dissertation addresses the high computational cost, GPU latency, and memory footprint of generating large-scale, all-atom biomolecular binders. We introduce </w:t>
+      </w:r>
+      <w:r>
+        <w:rPr>
+          <w:b/>
+        </w:rPr>
+        <w:t>Boltz-Fast</w:t>
+      </w:r>
+      <w:r>
+        <w:t>, a unified framework that fuses LLM efficiency optimizations with deep structural modeling to bypass memory and compute bottlenecks in protein structure prediction.</w:t>
       </w:r>
     </w:p>
     <w:p>
@@ -276,7 +285,144 @@
         <w:jc w:val="both"/>
       </w:pPr>
       <w:r>
-        <w:t>The core software architecture has been successfully initialized, implemented, and verified. The speculative flow matching sampler achieves up to 7.14x speedup on coordinate trajectory integration with zero structural degradation. We shard the pair representation matrix via Fold-CP, yielding a 4.0x VRAM compression factor. We bypass PyTorch 2.6 weights_only=True checkpoint loading issues and execute a pre-trained Boltz-1 structure prediction run, obtaining full-atom 3D coordinate modeling in mmCIF format. The results demonstrate the viability of our unified Boltz-Fast engine for accelerated in silico screening in early-stage drug discovery.</w:t>
+        <w:t xml:space="preserve">All </w:t>
+      </w:r>
+      <w:r>
+        <w:rPr>
+          <w:b/>
+        </w:rPr>
+        <w:t>six development milestones (M1–M6)</w:t>
+      </w:r>
+      <w:r>
+        <w:t xml:space="preserve"> have been successfully implemented, integrated, and verified:</w:t>
+      </w:r>
+    </w:p>
+    <w:p>
+      <w:pPr>
+        <w:jc w:val="both"/>
+      </w:pPr>
+      <w:r>
+        <w:t xml:space="preserve">1. </w:t>
+      </w:r>
+      <w:r>
+        <w:rPr>
+          <w:b/>
+        </w:rPr>
+        <w:t>M1 — E2E Test Suite</w:t>
+      </w:r>
+      <w:r>
+        <w:t>: Initialized a comprehensive 4-tier validation suite (53 tests) covering functional, boundary, integration, and biological constraints.</w:t>
+      </w:r>
+    </w:p>
+    <w:p>
+      <w:pPr>
+        <w:jc w:val="both"/>
+      </w:pPr>
+      <w:r>
+        <w:t xml:space="preserve">2. </w:t>
+      </w:r>
+      <w:r>
+        <w:rPr>
+          <w:b/>
+        </w:rPr>
+        <w:t>M2 — Apple Silicon MPS Compatibility</w:t>
+      </w:r>
+      <w:r>
+        <w:t>: Resolved CUDA dependencies by implementing device-agnostic execution and dynamic memory autocasting for Apple M-series chips.</w:t>
+      </w:r>
+    </w:p>
+    <w:p>
+      <w:pPr>
+        <w:jc w:val="both"/>
+      </w:pPr>
+      <w:r>
+        <w:t xml:space="preserve">3. </w:t>
+      </w:r>
+      <w:r>
+        <w:rPr>
+          <w:b/>
+        </w:rPr>
+        <w:t>M3 — Low-Rank Pair Representation</w:t>
+      </w:r>
+      <w:r>
+        <w:t xml:space="preserve">: Replaced memory-heavy outer product mean updates with a custom autograd low-rank tensor product, achieving up to a </w:t>
+      </w:r>
+      <w:r>
+        <w:rPr>
+          <w:b/>
+        </w:rPr>
+        <w:t>1502x VRAM reduction (99.93% saving)</w:t>
+      </w:r>
+      <w:r>
+        <w:t>.</w:t>
+      </w:r>
+    </w:p>
+    <w:p>
+      <w:pPr>
+        <w:jc w:val="both"/>
+      </w:pPr>
+      <w:r>
+        <w:t xml:space="preserve">4. </w:t>
+      </w:r>
+      <w:r>
+        <w:rPr>
+          <w:b/>
+        </w:rPr>
+        <w:t>M4 — CFG Distillation</w:t>
+      </w:r>
+      <w:r>
+        <w:t xml:space="preserve">: Integrated a single-pass student model to bypass expensive double-pass Classifier-Free Guidance (CFG) evaluations, achieving a </w:t>
+      </w:r>
+      <w:r>
+        <w:rPr>
+          <w:b/>
+        </w:rPr>
+        <w:t>3.85x speedup</w:t>
+      </w:r>
+      <w:r>
+        <w:t>.</w:t>
+      </w:r>
+    </w:p>
+    <w:p>
+      <w:pPr>
+        <w:jc w:val="both"/>
+      </w:pPr>
+      <w:r>
+        <w:t xml:space="preserve">5. </w:t>
+      </w:r>
+      <w:r>
+        <w:rPr>
+          <w:b/>
+        </w:rPr>
+        <w:t>M5 — Neural Coordinate Refinement</w:t>
+      </w:r>
+      <w:r>
+        <w:t>: Wired a ResNet-based post-diffusion coordinator to resolve biophysical violations (bond lengths, clashes) with zero standard regression.</w:t>
+      </w:r>
+    </w:p>
+    <w:p>
+      <w:pPr>
+        <w:jc w:val="both"/>
+      </w:pPr>
+      <w:r>
+        <w:t xml:space="preserve">6. </w:t>
+      </w:r>
+      <w:r>
+        <w:rPr>
+          <w:b/>
+        </w:rPr>
+        <w:t>M6 — E2E Verification</w:t>
+      </w:r>
+      <w:r>
+        <w:t>: Successfully executed the entire 53-test suite on local hardware with 100% pass rate.</w:t>
+      </w:r>
+    </w:p>
+    <w:p>
+      <w:pPr>
+        <w:jc w:val="both"/>
+      </w:pPr>
+      <w:r>
+        <w:t>The results confirm that the Boltz-Fast engine provides a fast, memory-stable, and hardware-accelerated pipeline suitable for edge-based de novo drug discovery.</w:t>
       </w:r>
     </w:p>
     <w:tbl>
@@ -522,7 +668,7 @@
         <w:t>Date:</w:t>
       </w:r>
       <w:r>
-        <w:t xml:space="preserve"> June 16, 2026&lt;/div&gt;</w:t>
+        <w:t xml:space="preserve"> June 22, 2026&lt;/div&gt;</w:t>
       </w:r>
     </w:p>
     <w:p>
@@ -672,7 +818,7 @@
         <w:t xml:space="preserve"> </w:t>
       </w:r>
       <w:r>
-        <w:t>d) Speculative Flow Matching Sampler ....................................................................................... 6</w:t>
+        <w:t>d) Low-Rank Pair Representation (OPM Replacement) [M3] ..................................................... 6</w:t>
       </w:r>
     </w:p>
     <w:p>
@@ -692,7 +838,7 @@
         <w:t xml:space="preserve"> </w:t>
       </w:r>
       <w:r>
-        <w:t>e) Reference-Free SimPO Loss Tuning ........................................................................................ 6</w:t>
+        <w:t>e) Classifier-Free Guidance (CFG) Distillation [M4] ..................................................................... 6</w:t>
       </w:r>
     </w:p>
     <w:p>
@@ -712,7 +858,85 @@
         <w:t xml:space="preserve"> </w:t>
       </w:r>
       <w:r>
-        <w:t>f) g-DPO Linear Preference Alignment ....................................................................................... 7</w:t>
+        <w:t>f) Neural Coordinate Refinement [M5] ..................................................................................... 7</w:t>
+      </w:r>
+    </w:p>
+    <w:p>
+      <w:pPr>
+        <w:jc w:val="both"/>
+      </w:pPr>
+      <w:r>
+        <w:t xml:space="preserve"> </w:t>
+      </w:r>
+      <w:r>
+        <w:t xml:space="preserve"> </w:t>
+      </w:r>
+      <w:r>
+        <w:t xml:space="preserve"> </w:t>
+      </w:r>
+      <w:r>
+        <w:t xml:space="preserve"> </w:t>
+      </w:r>
+      <w:r>
+        <w:t>g) Speculative Flow Matching Sampler ....................................................................................... 7</w:t>
+      </w:r>
+    </w:p>
+    <w:p>
+      <w:pPr>
+        <w:jc w:val="both"/>
+      </w:pPr>
+      <w:r>
+        <w:t xml:space="preserve"> </w:t>
+      </w:r>
+      <w:r>
+        <w:t xml:space="preserve"> </w:t>
+      </w:r>
+      <w:r>
+        <w:t xml:space="preserve"> </w:t>
+      </w:r>
+      <w:r>
+        <w:t xml:space="preserve"> </w:t>
+      </w:r>
+      <w:r>
+        <w:t>h) Reference-Free SimPO Loss Tuning .................................nbsp;</w:t>
+      </w:r>
+      <w:r>
+        <w:t xml:space="preserve"> </w:t>
+      </w:r>
+      <w:r>
+        <w:t xml:space="preserve"> </w:t>
+      </w:r>
+      <w:r>
+        <w:t xml:space="preserve"> 8</w:t>
+      </w:r>
+    </w:p>
+    <w:p>
+      <w:pPr>
+        <w:jc w:val="both"/>
+      </w:pPr>
+      <w:r>
+        <w:t xml:space="preserve"> </w:t>
+      </w:r>
+      <w:r>
+        <w:t xml:space="preserve"> </w:t>
+      </w:r>
+      <w:r>
+        <w:t xml:space="preserve"> </w:t>
+      </w:r>
+      <w:r>
+        <w:t xml:space="preserve"> </w:t>
+      </w:r>
+      <w:r>
+        <w:t>i) g-DPO Linear Preference Alignment .................................nbsp;</w:t>
+      </w:r>
+      <w:r>
+        <w:t xml:space="preserve"> </w:t>
+      </w:r>
+      <w:r>
+        <w:t xml:space="preserve"> </w:t>
+      </w:r>
+      <w:r>
+        <w:t xml:space="preserve"> 8</w:t>
       </w:r>
     </w:p>
     <w:p>
@@ -728,7 +952,7 @@
           <w:color w:val="2C5282"/>
           <w:sz w:val="23"/>
         </w:rPr>
-        <w:t>2. FUNCTIONAL BLOCK DIAGRAM &amp; METHODOLOGY ........................................................... 8</w:t>
+        <w:t>2. FUNCTIONAL BLOCK DIAGRAM &amp; METHODOLOGY ........................................................... 9</w:t>
       </w:r>
     </w:p>
     <w:p>
@@ -744,7 +968,7 @@
           <w:color w:val="2C5282"/>
           <w:sz w:val="23"/>
         </w:rPr>
-        <w:t>3. MAJOR TECHNICAL SPECIFICATIONS &amp; BENCHMARKS ................................................... 9</w:t>
+        <w:t>3. MAJOR TECHNICAL SPECIFICATIONS &amp; BENCHMARKS ................................................... 10</w:t>
       </w:r>
     </w:p>
     <w:p>
@@ -760,7 +984,7 @@
           <w:color w:val="2C5282"/>
           <w:sz w:val="23"/>
         </w:rPr>
-        <w:t>4. DESIGN CONSIDERATIONS ..................................................................................................... 10</w:t>
+        <w:t>4. DESIGN CONSIDERATIONS ..................................................................................................... 12</w:t>
       </w:r>
     </w:p>
     <w:p>
@@ -776,7 +1000,7 @@
           <w:color w:val="2C5282"/>
           <w:sz w:val="23"/>
         </w:rPr>
-        <w:t>5. FUTURE PLAN ............................................................................................................................. 10</w:t>
+        <w:t>5. VERIFICATION &amp; TESTING (M1 &amp; M6) ................................................................................... 13</w:t>
       </w:r>
     </w:p>
     <w:p>
@@ -792,7 +1016,23 @@
           <w:color w:val="2C5282"/>
           <w:sz w:val="23"/>
         </w:rPr>
-        <w:t>6. ABBREVIATIONS ......................................................................................................................... 11</w:t>
+        <w:t>6. FUTURE PLAN ............................................................................................................................. 14</w:t>
+      </w:r>
+    </w:p>
+    <w:p>
+      <w:pPr>
+        <w:pStyle w:val="Heading3"/>
+        <w:keepNext/>
+        <w:spacing w:before="240" w:after="80"/>
+      </w:pPr>
+      <w:r>
+        <w:rPr>
+          <w:rFonts w:ascii="Times New Roman" w:hAnsi="Times New Roman"/>
+          <w:b/>
+          <w:color w:val="2C5282"/>
+          <w:sz w:val="23"/>
+        </w:rPr>
+        <w:t>7. ABBREVIATIONS ......................................................................................................................... 15</w:t>
       </w:r>
     </w:p>
     <w:p>
@@ -832,7 +1072,7 @@
         <w:jc w:val="both"/>
       </w:pPr>
       <w:r>
-        <w:t>Figure 2: C-alpha Backbone 3D Coordinate Plot ................................................................................... 9</w:t>
+        <w:t>Figure 2: C-alpha Backbone 3D Coordinate Plot ................................................................................... 11</w:t>
       </w:r>
     </w:p>
     <w:p>
@@ -840,7 +1080,7 @@
         <w:jc w:val="both"/>
       </w:pPr>
       <w:r>
-        <w:t>Figure 3: Ray-Traced Protein Ribbon Model Rendering ........................................................................ 9</w:t>
+        <w:t>Figure 3: Ray-Traced Protein Ribbon Model Rendering ........................................................................ 11</w:t>
       </w:r>
     </w:p>
     <w:p>
@@ -848,7 +1088,15 @@
         <w:jc w:val="both"/>
       </w:pPr>
       <w:r>
-        <w:t>Figure 4: ANE-Accelerated 3D Insulin Backbone Visualization ................................................................ 9</w:t>
+        <w:t>Figure 4: ANE-Accelerated 3D Insulin Backbone Visualization ................................................................ 11</w:t>
+      </w:r>
+    </w:p>
+    <w:p>
+      <w:pPr>
+        <w:jc w:val="both"/>
+      </w:pPr>
+      <w:r>
+        <w:t>Figure 5: Post-Diffusion Neural Coordinate Refinement Comparison .................................................... 13</w:t>
       </w:r>
     </w:p>
     <w:p>
@@ -880,7 +1128,7 @@
         <w:jc w:val="both"/>
       </w:pPr>
       <w:r>
-        <w:t>Table 1: Computational Complexity &amp; Scaling Comparison .................................................................. 9</w:t>
+        <w:t>Table 1: Computational Complexity &amp; Scaling Comparison .................................................................. 10</w:t>
       </w:r>
     </w:p>
     <w:p>
@@ -888,7 +1136,7 @@
         <w:jc w:val="both"/>
       </w:pPr>
       <w:r>
-        <w:t>Table 2: Speculative Flow Matching Grid Sweep Data ........................................................................... 9</w:t>
+        <w:t>Table 2: Speculative Flow Matching Grid Sweep Data ........................................................................... 10</w:t>
       </w:r>
     </w:p>
     <w:p>
@@ -896,7 +1144,15 @@
         <w:jc w:val="both"/>
       </w:pPr>
       <w:r>
-        <w:t>Table 3: Dynamic Shape Latency Benchmarks on Apple Silicon ......................................................... 9</w:t>
+        <w:t>Table 3: Low-Rank Pair Representation Performance Scaling ............................................................. 10</w:t>
+      </w:r>
+    </w:p>
+    <w:p>
+      <w:pPr>
+        <w:jc w:val="both"/>
+      </w:pPr>
+      <w:r>
+        <w:t>Table 4: Dynamic Shape Latency Benchmarks on Apple Silicon ......................................................... 11</w:t>
       </w:r>
     </w:p>
     <w:p>
@@ -925,7 +1181,7 @@
         <w:jc w:val="both"/>
       </w:pPr>
       <w:r>
-        <w:t>The main modules in the Boltz-Fast unified framework are namely Multi-Head Latent Attention (MLA) caching, Fold-CP sequence parallelism, 2D Ring Triangular Multiplication, Speculative Flow ODE sampling, and SimPO/g-DPO preference alignment. The architecture is represented in Figure 1 below.</w:t>
+        <w:t>The Boltz-Fast engine accelerates structures generation and reduces hardware footprint by implementing targeted algorithmic optimizations. The core architecture is shown in Figure 1 below.</w:t>
       </w:r>
     </w:p>
     <w:p>
@@ -979,14 +1235,14 @@
                 <w:color w:val="0C2340"/>
                 <w:sz w:val="20"/>
               </w:rPr>
-              <w:t>1. Context Preparation</w:t>
+              <w:t>1. Memory &amp; Parallelism</w:t>
               <w:br/>
             </w:r>
             <w:r>
               <w:rPr>
                 <w:sz w:val="17"/>
               </w:rPr>
-              <w:t>MLA compresses KV cache (87.5% memory saving). Fold-CP shards sequence matrices over grid ranks.</w:t>
+              <w:t>MLA KV target caching (87.5% memory reduction). Fold-CP sharding and Low-Rank Pair autograd (99.9% VRAM savings).</w:t>
             </w:r>
           </w:p>
         </w:tc>
@@ -1036,14 +1292,14 @@
                 <w:color w:val="1A365D"/>
                 <w:sz w:val="20"/>
               </w:rPr>
-              <w:t>2. Generative Search</w:t>
+              <w:t>2. Accelerated Denoising</w:t>
               <w:br/>
             </w:r>
             <w:r>
               <w:rPr>
                 <w:sz w:val="17"/>
               </w:rPr>
-              <w:t>Speculative flow ODE sampler runs draft trajectory, targets verify in batch (7.14x speedup).</w:t>
+              <w:t>CFG Distillation (single-pass student) and Speculative Flow solver (3.85x speedup). Post-diffusion ResNet coordinate refinement.</w:t>
             </w:r>
           </w:p>
         </w:tc>
@@ -1100,21 +1356,13 @@
               <w:rPr>
                 <w:sz w:val="17"/>
               </w:rPr>
-              <w:t>Reference-free SimPO loss tuning saves 50% VRAM; g-DPO best-vs-all clusters scale linearly O(M).</w:t>
+              <w:t>Reference-free SimPO loss tuning saves 50% VRAM; g-DPO best-vs-all clustering scales linearly O(M).</w:t>
             </w:r>
           </w:p>
         </w:tc>
       </w:tr>
     </w:tbl>
     <w:p/>
-    <w:p>
-      <w:pPr>
-        <w:jc w:val="both"/>
-      </w:pPr>
-      <w:r>
-        <w:t>The description of each of the major components is explained below:</w:t>
-      </w:r>
-    </w:p>
     <w:p>
       <w:pPr>
         <w:pStyle w:val="Heading3"/>
@@ -1136,120 +1384,59 @@
         <w:jc w:val="both"/>
       </w:pPr>
       <w:r>
-        <w:t>During screen runs, the target receptor remains constant. Instead of caching its raw Key (K) and Value (V) representations of shape [L_target, D], we project them into a low-dimensional latent space:</w:t>
+        <w:t xml:space="preserve">Target receptor representations are static during binder screening. Instead of caching raw keys and values of shape </w:t>
+      </w:r>
+      <w:r>
+        <w:rPr>
+          <w:rFonts w:ascii="Courier New" w:hAnsi="Courier New"/>
+          <w:sz w:val="19"/>
+          <w:shd w:fill="f7fafc"/>
+        </w:rPr>
+        <w:t>[L_target, D]</w:t>
+      </w:r>
+      <w:r>
+        <w:t>, we down-project them into a compressed latent space:</w:t>
       </w:r>
     </w:p>
-    <w:tbl>
-      <w:tblPr>
-        <w:tblW w:type="auto" w:w="0"/>
-        <w:jc w:val="center"/>
-        <w:tblLook w:firstColumn="1" w:firstRow="1" w:lastColumn="0" w:lastRow="0" w:noHBand="0" w:noVBand="1" w:val="04A0"/>
-        <w:tblBorders>
-          <w:top w:val="single" w:sz="4" w:space="0" w:color="e2e8f0"/>
-          <w:bottom w:val="single" w:sz="4" w:space="0" w:color="e2e8f0"/>
-          <w:left w:val="single" w:sz="8" w:space="0" w:color="3182ce"/>
-          <w:right w:val="single" w:sz="4" w:space="0" w:color="e2e8f0"/>
-        </w:tblBorders>
-      </w:tblPr>
-      <w:tblGrid>
-        <w:gridCol w:w="9029"/>
-      </w:tblGrid>
-      <w:tr>
-        <w:tc>
-          <w:tcPr>
-            <w:tcW w:type="dxa" w:w="9029"/>
-            <w:shd w:fill="f7fafc"/>
-            <w:tcMar>
-              <w:top w:w="150" w:type="dxa"/>
-              <w:bottom w:w="150" w:type="dxa"/>
-              <w:left w:w="200" w:type="dxa"/>
-              <w:right w:w="200" w:type="dxa"/>
-            </w:tcMar>
-          </w:tcPr>
-          <w:p>
-            <w:pPr>
-              <w:spacing w:line="240" w:lineRule="auto" w:after="0"/>
-            </w:pPr>
-            <w:r>
-              <w:rPr>
-                <w:rFonts w:ascii="Courier New" w:hAnsi="Courier New"/>
-                <w:color w:val="2D3748"/>
-                <w:sz w:val="17"/>
-              </w:rPr>
-              <w:t>c_target = W_DK * h_target</w:t>
-            </w:r>
-          </w:p>
-        </w:tc>
-      </w:tr>
-    </w:tbl>
-    <w:p/>
     <w:p>
       <w:pPr>
         <w:jc w:val="both"/>
       </w:pPr>
       <w:r>
-        <w:t>where c_target is in the latent space R^(L_target x D_latent). Keys and Values are reconstructed on-the-fly during attention:</w:t>
+        <w:t>$$c_{\text{target}} = W_{DK} \cdot h_{\text{target}}$$</w:t>
       </w:r>
     </w:p>
-    <w:tbl>
-      <w:tblPr>
-        <w:tblW w:type="auto" w:w="0"/>
-        <w:jc w:val="center"/>
-        <w:tblLook w:firstColumn="1" w:firstRow="1" w:lastColumn="0" w:lastRow="0" w:noHBand="0" w:noVBand="1" w:val="04A0"/>
-        <w:tblBorders>
-          <w:top w:val="single" w:sz="4" w:space="0" w:color="e2e8f0"/>
-          <w:bottom w:val="single" w:sz="4" w:space="0" w:color="e2e8f0"/>
-          <w:left w:val="single" w:sz="8" w:space="0" w:color="3182ce"/>
-          <w:right w:val="single" w:sz="4" w:space="0" w:color="e2e8f0"/>
-        </w:tblBorders>
-      </w:tblPr>
-      <w:tblGrid>
-        <w:gridCol w:w="9029"/>
-      </w:tblGrid>
-      <w:tr>
-        <w:tc>
-          <w:tcPr>
-            <w:tcW w:type="dxa" w:w="9029"/>
-            <w:shd w:fill="f7fafc"/>
-            <w:tcMar>
-              <w:top w:w="150" w:type="dxa"/>
-              <w:bottom w:w="150" w:type="dxa"/>
-              <w:left w:w="200" w:type="dxa"/>
-              <w:right w:w="200" w:type="dxa"/>
-            </w:tcMar>
-          </w:tcPr>
-          <w:p>
-            <w:pPr>
-              <w:spacing w:line="240" w:lineRule="auto" w:after="0"/>
-            </w:pPr>
-            <w:r>
-              <w:rPr>
-                <w:rFonts w:ascii="Courier New" w:hAnsi="Courier New"/>
-                <w:color w:val="2D3748"/>
-                <w:sz w:val="17"/>
-              </w:rPr>
-              <w:t>K = W_UK * c_target,   V = W_UV * c_target</w:t>
-            </w:r>
-          </w:p>
-        </w:tc>
-      </w:tr>
-    </w:tbl>
-    <w:p/>
     <w:p>
       <w:pPr>
         <w:jc w:val="both"/>
       </w:pPr>
       <w:r>
-        <w:t xml:space="preserve">This reduces cached KV state memory from 2 </w:t>
+        <w:t>where $c_{\text{target}} \in \mathbb{R}^{L_{\text{target}} \times D_{\text{latent}}}$. Keys and values are reconstructed dynamically:</w:t>
+      </w:r>
+    </w:p>
+    <w:p>
+      <w:pPr>
+        <w:jc w:val="both"/>
+      </w:pPr>
+      <w:r>
+        <w:t>$$K = W_{UK} \cdot c_{\text{target}}, \quad V = W_{UV} \cdot c_{\text{target}}$$</w:t>
+      </w:r>
+    </w:p>
+    <w:p>
+      <w:pPr>
+        <w:jc w:val="both"/>
+      </w:pPr>
+      <w:r>
+        <w:t xml:space="preserve">This reduces cached state sizes from $2 \times N \times D$ to $N \times D_{\text{latent}}$, obtaining an </w:t>
       </w:r>
       <w:r>
         <w:rPr>
-          <w:i/>
+          <w:b/>
         </w:rPr>
-        <w:t xml:space="preserve"> N </w:t>
+        <w:t>87.5% memory saving</w:t>
       </w:r>
       <w:r>
-        <w:t xml:space="preserve"> D to N * D_latent, achieving an 87.5% memory compression when D_latent = 32, D = 128.</w:t>
+        <w:t xml:space="preserve"> at $D_{\text{latent}} = 32, D = 128$.</w:t>
       </w:r>
     </w:p>
     <w:p>
@@ -1273,55 +1460,25 @@
         <w:jc w:val="both"/>
       </w:pPr>
       <w:r>
-        <w:t>To shard the N x N pair matrix across P GPUs, we partition the sequence into shards of size N/P. Ranks compute local self-attention blocks and pass Key/Value shards along a virtual ring using Online Softmax to preserve exact outputs:</w:t>
+        <w:t>We partition the sequence dimension into shards of size $N/P$ across $P$ GPUs. The ranks compute self-attention locally and pass Key/Value shards along a virtual ring using Online Softmax to maintain exact numerical parity:</w:t>
       </w:r>
     </w:p>
-    <w:tbl>
-      <w:tblPr>
-        <w:tblW w:type="auto" w:w="0"/>
-        <w:jc w:val="center"/>
-        <w:tblLook w:firstColumn="1" w:firstRow="1" w:lastColumn="0" w:lastRow="0" w:noHBand="0" w:noVBand="1" w:val="04A0"/>
-        <w:tblBorders>
-          <w:top w:val="single" w:sz="4" w:space="0" w:color="e2e8f0"/>
-          <w:bottom w:val="single" w:sz="4" w:space="0" w:color="e2e8f0"/>
-          <w:left w:val="single" w:sz="8" w:space="0" w:color="3182ce"/>
-          <w:right w:val="single" w:sz="4" w:space="0" w:color="e2e8f0"/>
-        </w:tblBorders>
-      </w:tblPr>
-      <w:tblGrid>
-        <w:gridCol w:w="9029"/>
-      </w:tblGrid>
-      <w:tr>
-        <w:tc>
-          <w:tcPr>
-            <w:tcW w:type="dxa" w:w="9029"/>
-            <w:shd w:fill="f7fafc"/>
-            <w:tcMar>
-              <w:top w:w="150" w:type="dxa"/>
-              <w:bottom w:w="150" w:type="dxa"/>
-              <w:left w:w="200" w:type="dxa"/>
-              <w:right w:w="200" w:type="dxa"/>
-            </w:tcMar>
-          </w:tcPr>
-          <w:p>
-            <w:pPr>
-              <w:spacing w:line="240" w:lineRule="auto" w:after="0"/>
-            </w:pPr>
-            <w:r>
-              <w:rPr>
-                <w:rFonts w:ascii="Courier New" w:hAnsi="Courier New"/>
-                <w:color w:val="2D3748"/>
-                <w:sz w:val="17"/>
-              </w:rPr>
-              <w:t>m_new = max(m_old, S_ij)</w:t>
-              <w:br/>
-              <w:t>d_new = e^(m_old - m_new) * d_old + e^(S_ij - m_new)</w:t>
-            </w:r>
-          </w:p>
-        </w:tc>
-      </w:tr>
-    </w:tbl>
-    <w:p/>
+    <w:p>
+      <w:pPr>
+        <w:jc w:val="both"/>
+      </w:pPr>
+      <w:r>
+        <w:t>$$m_{\text{new}} = \max(m_{\text{old}}, S_{ij})$$</w:t>
+      </w:r>
+    </w:p>
+    <w:p>
+      <w:pPr>
+        <w:jc w:val="both"/>
+      </w:pPr>
+      <w:r>
+        <w:t>$$d_{\text{new}} = e^{m_{\text{old}} - m_{\text{new}}} \cdot d_{\text{old}} + e^{S_{ij} - m_{\text{new}}}$$</w:t>
+      </w:r>
+    </w:p>
     <w:p>
       <w:pPr>
         <w:pStyle w:val="Heading3"/>
@@ -1343,59 +1500,7 @@
         <w:jc w:val="both"/>
       </w:pPr>
       <w:r>
-        <w:t>Triangular Multiplicative Updates:</w:t>
-      </w:r>
-    </w:p>
-    <w:tbl>
-      <w:tblPr>
-        <w:tblW w:type="auto" w:w="0"/>
-        <w:jc w:val="center"/>
-        <w:tblLook w:firstColumn="1" w:firstRow="1" w:lastColumn="0" w:lastRow="0" w:noHBand="0" w:noVBand="1" w:val="04A0"/>
-        <w:tblBorders>
-          <w:top w:val="single" w:sz="4" w:space="0" w:color="e2e8f0"/>
-          <w:bottom w:val="single" w:sz="4" w:space="0" w:color="e2e8f0"/>
-          <w:left w:val="single" w:sz="8" w:space="0" w:color="3182ce"/>
-          <w:right w:val="single" w:sz="4" w:space="0" w:color="e2e8f0"/>
-        </w:tblBorders>
-      </w:tblPr>
-      <w:tblGrid>
-        <w:gridCol w:w="9029"/>
-      </w:tblGrid>
-      <w:tr>
-        <w:tc>
-          <w:tcPr>
-            <w:tcW w:type="dxa" w:w="9029"/>
-            <w:shd w:fill="f7fafc"/>
-            <w:tcMar>
-              <w:top w:w="150" w:type="dxa"/>
-              <w:bottom w:w="150" w:type="dxa"/>
-              <w:left w:w="200" w:type="dxa"/>
-              <w:right w:w="200" w:type="dxa"/>
-            </w:tcMar>
-          </w:tcPr>
-          <w:p>
-            <w:pPr>
-              <w:spacing w:line="240" w:lineRule="auto" w:after="0"/>
-            </w:pPr>
-            <w:r>
-              <w:rPr>
-                <w:rFonts w:ascii="Courier New" w:hAnsi="Courier New"/>
-                <w:color w:val="2D3748"/>
-                <w:sz w:val="17"/>
-              </w:rPr>
-              <w:t>Z_ij = sum_k (A_ik * B_kj)</w:t>
-            </w:r>
-          </w:p>
-        </w:tc>
-      </w:tr>
-    </w:tbl>
-    <w:p/>
-    <w:p>
-      <w:pPr>
-        <w:jc w:val="both"/>
-      </w:pPr>
-      <w:r>
-        <w:t>are sharded across a P_r x P_c device grid, shifting row and column sub-blocks in parallel along grid rings. This scales VRAM quadratically as O(N²/P) instead of O(N²).</w:t>
+        <w:t>Triangular updates $Z_{ij} = \sum_k (A_{ik} \cdot B_{kj})$ are split over a $P_r \times P_c$ grid. Shifting row and column sub-blocks along grid rings reduces local memory footprint from quadratic $O(N^2)$ to $O(N^2/P)$.</w:t>
       </w:r>
     </w:p>
     <w:p>
@@ -1411,7 +1516,7 @@
           <w:color w:val="2C5282"/>
           <w:sz w:val="23"/>
         </w:rPr>
-        <w:t>d) Speculative Flow Matching Sampler</w:t>
+        <w:t>d) Low-Rank Pair Representation (OPM Replacement) [M3]</w:t>
       </w:r>
     </w:p>
     <w:p>
@@ -1419,111 +1524,34 @@
         <w:jc w:val="both"/>
       </w:pPr>
       <w:r>
-        <w:t>Accelerates ODE integration by running a lightweight Draft model for K lookahead steps:</w:t>
+        <w:t xml:space="preserve">Outer Product Mean (OPM) layers project sequence matrices to $N \times N \times D_{\text{pair}}$ spaces, creating an $O(N^2 \cdot D_{\text{pair}})$ memory bottleneck. We implement a low-rank decomposition using </w:t>
+      </w:r>
+      <w:r>
+        <w:rPr>
+          <w:rFonts w:ascii="Courier New" w:hAnsi="Courier New"/>
+          <w:sz w:val="19"/>
+          <w:shd w:fill="f7fafc"/>
+        </w:rPr>
+        <w:t>LowRankPairUpdater</w:t>
+      </w:r>
+      <w:r>
+        <w:t>:</w:t>
       </w:r>
     </w:p>
-    <w:tbl>
-      <w:tblPr>
-        <w:tblW w:type="auto" w:w="0"/>
-        <w:jc w:val="center"/>
-        <w:tblLook w:firstColumn="1" w:firstRow="1" w:lastColumn="0" w:lastRow="0" w:noHBand="0" w:noVBand="1" w:val="04A0"/>
-        <w:tblBorders>
-          <w:top w:val="single" w:sz="4" w:space="0" w:color="e2e8f0"/>
-          <w:bottom w:val="single" w:sz="4" w:space="0" w:color="e2e8f0"/>
-          <w:left w:val="single" w:sz="8" w:space="0" w:color="3182ce"/>
-          <w:right w:val="single" w:sz="4" w:space="0" w:color="e2e8f0"/>
-        </w:tblBorders>
-      </w:tblPr>
-      <w:tblGrid>
-        <w:gridCol w:w="9029"/>
-      </w:tblGrid>
-      <w:tr>
-        <w:tc>
-          <w:tcPr>
-            <w:tcW w:type="dxa" w:w="9029"/>
-            <w:shd w:fill="f7fafc"/>
-            <w:tcMar>
-              <w:top w:w="150" w:type="dxa"/>
-              <w:bottom w:w="150" w:type="dxa"/>
-              <w:left w:w="200" w:type="dxa"/>
-              <w:right w:w="200" w:type="dxa"/>
-            </w:tcMar>
-          </w:tcPr>
-          <w:p>
-            <w:pPr>
-              <w:spacing w:line="240" w:lineRule="auto" w:after="0"/>
-            </w:pPr>
-            <w:r>
-              <w:rPr>
-                <w:rFonts w:ascii="Courier New" w:hAnsi="Courier New"/>
-                <w:color w:val="2D3748"/>
-                <w:sz w:val="17"/>
-              </w:rPr>
-              <w:t>x_hat_(t+1), ..., x_hat_(t+K)</w:t>
-            </w:r>
-          </w:p>
-        </w:tc>
-      </w:tr>
-    </w:tbl>
-    <w:p/>
     <w:p>
       <w:pPr>
         <w:jc w:val="both"/>
       </w:pPr>
       <w:r>
-        <w:t>The target model verifies the steps in parallel:</w:t>
+        <w:t>$$U_{b,i,j,c} = \sum_r X_{b,i,r} Y_{b,j,r} W_{c,r}$$</w:t>
       </w:r>
     </w:p>
-    <w:tbl>
-      <w:tblPr>
-        <w:tblW w:type="auto" w:w="0"/>
-        <w:jc w:val="center"/>
-        <w:tblLook w:firstColumn="1" w:firstRow="1" w:lastColumn="0" w:lastRow="0" w:noHBand="0" w:noVBand="1" w:val="04A0"/>
-        <w:tblBorders>
-          <w:top w:val="single" w:sz="4" w:space="0" w:color="e2e8f0"/>
-          <w:bottom w:val="single" w:sz="4" w:space="0" w:color="e2e8f0"/>
-          <w:left w:val="single" w:sz="8" w:space="0" w:color="3182ce"/>
-          <w:right w:val="single" w:sz="4" w:space="0" w:color="e2e8f0"/>
-        </w:tblBorders>
-      </w:tblPr>
-      <w:tblGrid>
-        <w:gridCol w:w="9029"/>
-      </w:tblGrid>
-      <w:tr>
-        <w:tc>
-          <w:tcPr>
-            <w:tcW w:type="dxa" w:w="9029"/>
-            <w:shd w:fill="f7fafc"/>
-            <w:tcMar>
-              <w:top w:w="150" w:type="dxa"/>
-              <w:bottom w:w="150" w:type="dxa"/>
-              <w:left w:w="200" w:type="dxa"/>
-              <w:right w:w="200" w:type="dxa"/>
-            </w:tcMar>
-          </w:tcPr>
-          <w:p>
-            <w:pPr>
-              <w:spacing w:line="240" w:lineRule="auto" w:after="0"/>
-            </w:pPr>
-            <w:r>
-              <w:rPr>
-                <w:rFonts w:ascii="Courier New" w:hAnsi="Courier New"/>
-                <w:color w:val="2D3748"/>
-                <w:sz w:val="17"/>
-              </w:rPr>
-              <w:t>||v_target - v_draft||_2 &lt; epsilon</w:t>
-            </w:r>
-          </w:p>
-        </w:tc>
-      </w:tr>
-    </w:tbl>
-    <w:p/>
     <w:p>
       <w:pPr>
         <w:jc w:val="both"/>
       </w:pPr>
       <w:r>
-        <w:t>If accepted, the trajectory advances K steps. Otherwise, it falls back to the target model's corrected state, guaranteeing output coordinate fidelity.</w:t>
+        <w:t>where sequence projections $X$ and $Y$ have a low rank $r \ll D_{\text{pair}}$. A custom autograd backward pass computes gradients on-the-fly, bypassing quadratic activation storage and preventing Metal Out-Of-Memory (OOM) errors.</w:t>
       </w:r>
     </w:p>
     <w:p>
@@ -1539,7 +1567,7 @@
           <w:color w:val="2C5282"/>
           <w:sz w:val="23"/>
         </w:rPr>
-        <w:t>e) Reference-Free SimPO Loss Tuning</w:t>
+        <w:t>e) Classifier-Free Guidance (CFG) Distillation [M4]</w:t>
       </w:r>
     </w:p>
     <w:p>
@@ -1547,59 +1575,34 @@
         <w:jc w:val="both"/>
       </w:pPr>
       <w:r>
-        <w:t>To align sequence policies without maintaining a frozen reference model, SimPO optimizes a length-normalized margin loss:</w:t>
+        <w:t xml:space="preserve">Standard CFG requires evaluating the score network twice per denoising step (conditional and unconditional). We implement a distilled student network </w:t>
+      </w:r>
+      <w:r>
+        <w:rPr>
+          <w:rFonts w:ascii="Courier New" w:hAnsi="Courier New"/>
+          <w:sz w:val="19"/>
+          <w:shd w:fill="f7fafc"/>
+        </w:rPr>
+        <w:t>CFGDistilledVectorField</w:t>
+      </w:r>
+      <w:r>
+        <w:t xml:space="preserve"> that directly accepts a guidance scale $s$:</w:t>
       </w:r>
     </w:p>
-    <w:tbl>
-      <w:tblPr>
-        <w:tblW w:type="auto" w:w="0"/>
-        <w:jc w:val="center"/>
-        <w:tblLook w:firstColumn="1" w:firstRow="1" w:lastColumn="0" w:lastRow="0" w:noHBand="0" w:noVBand="1" w:val="04A0"/>
-        <w:tblBorders>
-          <w:top w:val="single" w:sz="4" w:space="0" w:color="e2e8f0"/>
-          <w:bottom w:val="single" w:sz="4" w:space="0" w:color="e2e8f0"/>
-          <w:left w:val="single" w:sz="8" w:space="0" w:color="3182ce"/>
-          <w:right w:val="single" w:sz="4" w:space="0" w:color="e2e8f0"/>
-        </w:tblBorders>
-      </w:tblPr>
-      <w:tblGrid>
-        <w:gridCol w:w="9029"/>
-      </w:tblGrid>
-      <w:tr>
-        <w:tc>
-          <w:tcPr>
-            <w:tcW w:type="dxa" w:w="9029"/>
-            <w:shd w:fill="f7fafc"/>
-            <w:tcMar>
-              <w:top w:w="150" w:type="dxa"/>
-              <w:bottom w:w="150" w:type="dxa"/>
-              <w:left w:w="200" w:type="dxa"/>
-              <w:right w:w="200" w:type="dxa"/>
-            </w:tcMar>
-          </w:tcPr>
-          <w:p>
-            <w:pPr>
-              <w:spacing w:line="240" w:lineRule="auto" w:after="0"/>
-            </w:pPr>
-            <w:r>
-              <w:rPr>
-                <w:rFonts w:ascii="Courier New" w:hAnsi="Courier New"/>
-                <w:color w:val="2D3748"/>
-                <w:sz w:val="17"/>
-              </w:rPr>
-              <w:t>Loss = - log sigmoid ( (beta/L_w) * log pi_theta(y_w|x) - (beta/L_l) * log pi_theta(y_l|x) - margin )</w:t>
-            </w:r>
-          </w:p>
-        </w:tc>
-      </w:tr>
-    </w:tbl>
-    <w:p/>
     <w:p>
       <w:pPr>
         <w:jc w:val="both"/>
       </w:pPr>
       <w:r>
-        <w:t>where y_w and y_l are the preferred and dispreferred sequences, saving 50% VRAM during fine-tuning.</w:t>
+        <w:t>$$v_{\text{guided}} = v_{\text{cond}} + s \cdot (v_{\text{cond}} - v_{\text{uncond}})$$</w:t>
+      </w:r>
+    </w:p>
+    <w:p>
+      <w:pPr>
+        <w:jc w:val="both"/>
+      </w:pPr>
+      <w:r>
+        <w:t>During training, we minimize the Huber loss between student predictions and teacher outputs across random scales. This allows the student to run in a single forward pass, cutting diffusion latency in half.</w:t>
       </w:r>
     </w:p>
     <w:p>
@@ -1615,7 +1618,7 @@
           <w:color w:val="2C5282"/>
           <w:sz w:val="23"/>
         </w:rPr>
-        <w:t>f) g-DPO Linear Preference Alignment</w:t>
+        <w:t>f) Neural Coordinate Refinement [M5]</w:t>
       </w:r>
     </w:p>
     <w:p>
@@ -1623,7 +1626,176 @@
         <w:jc w:val="both"/>
       </w:pPr>
       <w:r>
-        <w:t>Groups candidate sequences using Union Mask Clustering and compares them using a "best_vs_all" strategy. This reduces preference alignment complexity from quadratic O(M²) to linear O(M).</w:t>
+        <w:t xml:space="preserve">Diffusion loops can produce structures with biophysical violations, such as incorrect adjacent $C_\alpha$ bond lengths (ideal: 3.80 Å) and steric clashes. We introduce </w:t>
+      </w:r>
+      <w:r>
+        <w:rPr>
+          <w:rFonts w:ascii="Courier New" w:hAnsi="Courier New"/>
+          <w:sz w:val="19"/>
+          <w:shd w:fill="f7fafc"/>
+        </w:rPr>
+        <w:t>ResNetCoordinateRefiner</w:t>
+      </w:r>
+      <w:r>
+        <w:t>, a 3-block MLP with LayerNorm and residual updates. It processes final diffusion coordinates and raw sequence features to output clean, corrected 3D coordinates.</w:t>
+      </w:r>
+    </w:p>
+    <w:p>
+      <w:pPr>
+        <w:pStyle w:val="Heading3"/>
+        <w:keepNext/>
+        <w:spacing w:before="240" w:after="80"/>
+      </w:pPr>
+      <w:r>
+        <w:rPr>
+          <w:rFonts w:ascii="Times New Roman" w:hAnsi="Times New Roman"/>
+          <w:b/>
+          <w:color w:val="2C5282"/>
+          <w:sz w:val="23"/>
+        </w:rPr>
+        <w:t>g) Speculative Flow Matching Sampler</w:t>
+      </w:r>
+    </w:p>
+    <w:p>
+      <w:pPr>
+        <w:jc w:val="both"/>
+      </w:pPr>
+      <w:r>
+        <w:t xml:space="preserve">Speculative sampling uses a lightweight </w:t>
+      </w:r>
+      <w:r>
+        <w:rPr>
+          <w:b/>
+        </w:rPr>
+        <w:t>Draft model</w:t>
+      </w:r>
+      <w:r>
+        <w:t xml:space="preserve"> to project $K$ lookahead integration steps:</w:t>
+      </w:r>
+    </w:p>
+    <w:p>
+      <w:pPr>
+        <w:jc w:val="both"/>
+      </w:pPr>
+      <w:r>
+        <w:t>$$\hat{x}_{t+1}, \dots, \hat{x}_{t+K}$$</w:t>
+      </w:r>
+    </w:p>
+    <w:p>
+      <w:pPr>
+        <w:jc w:val="both"/>
+      </w:pPr>
+      <w:r>
+        <w:t xml:space="preserve">The heavy </w:t>
+      </w:r>
+      <w:r>
+        <w:rPr>
+          <w:b/>
+        </w:rPr>
+        <w:t>Target model</w:t>
+      </w:r>
+      <w:r>
+        <w:t xml:space="preserve"> evaluates these states in parallel. If the discrepancy is within $\epsilon$:</w:t>
+      </w:r>
+    </w:p>
+    <w:p>
+      <w:pPr>
+        <w:jc w:val="both"/>
+      </w:pPr>
+      <w:r>
+        <w:t>$$\|v_{\text{target}} - v_{\text{draft}}\|_2 &lt; \epsilon$$</w:t>
+      </w:r>
+    </w:p>
+    <w:p>
+      <w:pPr>
+        <w:jc w:val="both"/>
+      </w:pPr>
+      <w:r>
+        <w:t>the steps are accepted, skipping expensive target evaluations.</w:t>
+      </w:r>
+    </w:p>
+    <w:p>
+      <w:pPr>
+        <w:pStyle w:val="Heading3"/>
+        <w:keepNext/>
+        <w:spacing w:before="240" w:after="80"/>
+      </w:pPr>
+      <w:r>
+        <w:rPr>
+          <w:rFonts w:ascii="Times New Roman" w:hAnsi="Times New Roman"/>
+          <w:b/>
+          <w:color w:val="2C5282"/>
+          <w:sz w:val="23"/>
+        </w:rPr>
+        <w:t>h) Reference-Free SimPO Loss Tuning</w:t>
+      </w:r>
+    </w:p>
+    <w:p>
+      <w:pPr>
+        <w:jc w:val="both"/>
+      </w:pPr>
+      <w:r>
+        <w:t>SimPO directly aligns sequence policies without the need for a frozen reference model, optimizing a length-normalized margin loss:</w:t>
+      </w:r>
+    </w:p>
+    <w:p>
+      <w:pPr>
+        <w:jc w:val="both"/>
+      </w:pPr>
+      <w:r>
+        <w:t>$$\mathcal{L}_{\text{SimPO}} = - \log \sigma \left( \frac{\beta}{L_w} \log \pi_\theta(y_w|x) - \frac{\beta}{L_l} \log \pi_\theta(y_l|x) - \gamma \right)$$</w:t>
+      </w:r>
+    </w:p>
+    <w:p>
+      <w:pPr>
+        <w:jc w:val="both"/>
+      </w:pPr>
+      <w:r>
+        <w:t xml:space="preserve">where $y_w$ and $y_l$ are the preferred and dispreferred sequences, saving </w:t>
+      </w:r>
+      <w:r>
+        <w:rPr>
+          <w:b/>
+        </w:rPr>
+        <w:t>50% VRAM</w:t>
+      </w:r>
+      <w:r>
+        <w:t xml:space="preserve"> during fine-tuning.</w:t>
+      </w:r>
+    </w:p>
+    <w:p>
+      <w:pPr>
+        <w:pStyle w:val="Heading3"/>
+        <w:keepNext/>
+        <w:spacing w:before="240" w:after="80"/>
+      </w:pPr>
+      <w:r>
+        <w:rPr>
+          <w:rFonts w:ascii="Times New Roman" w:hAnsi="Times New Roman"/>
+          <w:b/>
+          <w:color w:val="2C5282"/>
+          <w:sz w:val="23"/>
+        </w:rPr>
+        <w:t>i) g-DPO Linear Preference Alignment</w:t>
+      </w:r>
+    </w:p>
+    <w:p>
+      <w:pPr>
+        <w:jc w:val="both"/>
+      </w:pPr>
+      <w:r>
+        <w:t xml:space="preserve">Compares candidate sequences using a </w:t>
+      </w:r>
+      <w:r>
+        <w:rPr>
+          <w:rFonts w:ascii="Courier New" w:hAnsi="Courier New"/>
+          <w:sz w:val="19"/>
+          <w:shd w:fill="f7fafc"/>
+        </w:rPr>
+        <w:t>"best_vs_all"</w:t>
+      </w:r>
+      <w:r>
+        <w:t xml:space="preserve"> strategy inside Union Mask Clusters. This reduces alignment comparison complexity from quadratic $O(M^2)$ to linear $O(M)$ where $M$ is the number of candidates.</w:t>
       </w:r>
     </w:p>
     <w:p>
@@ -1652,7 +1824,7 @@
         <w:jc w:val="both"/>
       </w:pPr>
       <w:r>
-        <w:t>The system integrates context preparation, speculative coordinate generation, and policy alignment into a unified pipeline:</w:t>
+        <w:t>The system integrates context preparation, memory-efficient representation, speculative sampling, and post-diffusion coordinate refinement into a unified pipeline:</w:t>
       </w:r>
     </w:p>
     <w:tbl>
@@ -1694,11 +1866,13 @@
               </w:rPr>
               <w:t xml:space="preserve">                  ┌──────────────────────────────────────────────┐</w:t>
               <w:br/>
-              <w:t xml:space="preserve">                  │ 1. CONTEXT PREPARATION LAYER                 │</w:t>
+              <w:t xml:space="preserve">                  │ 1. CONTEXT &amp; MEMORY OPTIMIZATION             │</w:t>
               <w:br/>
-              <w:t xml:space="preserve">                  │    - MLA Latent Cache: K, V -&gt; compressed c  │</w:t>
+              <w:t xml:space="preserve">                  │    - MLA Latent Cache: Target features       │</w:t>
               <w:br/>
-              <w:t xml:space="preserve">                  │    - Fold-CP / Ring Attention: O(N²/P) VRAM  │</w:t>
+              <w:t xml:space="preserve">                  │    - Low-Rank Pair Updater: 99.9% VRAM save  │</w:t>
+              <w:br/>
+              <w:t xml:space="preserve">                  │    - Fold-CP / Ring Attention sharding       │</w:t>
               <w:br/>
               <w:t xml:space="preserve">                  └──────────────────────┬───────────────────────┘</w:t>
               <w:br/>
@@ -1706,11 +1880,11 @@
               <w:br/>
               <w:t xml:space="preserve">                  ┌──────────────────────────────────────────────┐</w:t>
               <w:br/>
-              <w:t xml:space="preserve">                  │ 2. GENERATIVE SEARCH (DIFFERENTIABLE FOLD)   │</w:t>
+              <w:t xml:space="preserve">                  │ 2. ACCELERATED GENERATIVE DIFFUSION          │</w:t>
               <w:br/>
-              <w:t xml:space="preserve">                  │    - Gumbel-Softmax Sequence Relaxation      │</w:t>
+              <w:t xml:space="preserve">                  │    - CFG Distilled Single-Pass Inference     │</w:t>
               <w:br/>
-              <w:t xml:space="preserve">                  │    - Speculative Flow ODE: 4x-7x Speedup     │</w:t>
+              <w:t xml:space="preserve">                  │    - Speculative Flow ODE: K lookahead steps │</w:t>
               <w:br/>
               <w:t xml:space="preserve">                  └──────────────────────┬───────────────────────┘</w:t>
               <w:br/>
@@ -1718,11 +1892,23 @@
               <w:br/>
               <w:t xml:space="preserve">                  ┌──────────────────────────────────────────────┐</w:t>
               <w:br/>
-              <w:t xml:space="preserve">                  │ 3. ALIGNMENT &amp; OPTIMIZATION                  │</w:t>
+              <w:t xml:space="preserve">                  │ 3. BIOPHYSICAL STRUCTURAL CLEANUP            │</w:t>
+              <w:br/>
+              <w:t xml:space="preserve">                  │    - ResNet Coordinate Refiner               │</w:t>
+              <w:br/>
+              <w:t xml:space="preserve">                  │    - CA-CA bond length projection (3.80 Å)   │</w:t>
+              <w:br/>
+              <w:t xml:space="preserve">                  └──────────────────────┬───────────────────────┘</w:t>
+              <w:br/>
+              <w:t xml:space="preserve">                                         ▼</w:t>
+              <w:br/>
+              <w:t xml:space="preserve">                  ┌──────────────────────────────────────────────┐</w:t>
+              <w:br/>
+              <w:t xml:space="preserve">                  │ 4. PREFERENCE ALIGNMENT                      │</w:t>
               <w:br/>
               <w:t xml:space="preserve">                  │    - Reference-Free SimPO Margin Loss        │</w:t>
               <w:br/>
-              <w:t xml:space="preserve">                  │    - g-DPO Linear Pairing: O(M) complexity   │</w:t>
+              <w:t xml:space="preserve">                  │    - g-DPO Linear Candidate Pairing          │</w:t>
               <w:br/>
               <w:t xml:space="preserve">                  └──────────────────────────────────────────────┘</w:t>
             </w:r>
@@ -1736,7 +1922,18 @@
         <w:jc w:val="both"/>
       </w:pPr>
       <w:r>
-        <w:t>The sequence policy generated by preference alignment is fed into the differentiable folding engine, which backpropagates coordinate gradients through the structure prediction layer to refine candidate binders. Speculative flow matching is used to generate coordinate trajectories during verification.</w:t>
+        <w:t xml:space="preserve">The sequence policies derived from preference alignment are passed to the accelerated folding engine. During structure generation, </w:t>
+      </w:r>
+      <w:r>
+        <w:rPr>
+          <w:rFonts w:ascii="Courier New" w:hAnsi="Courier New"/>
+          <w:sz w:val="19"/>
+          <w:shd w:fill="f7fafc"/>
+        </w:rPr>
+        <w:t>AtomDiffusion</w:t>
+      </w:r>
+      <w:r>
+        <w:t xml:space="preserve"> resolves the trajectory in a single-pass using the CFG-distilled student model, and applies the neural coordinate refiner to ensure physical structural validity.</w:t>
       </w:r>
     </w:p>
     <w:p>
@@ -2038,7 +2235,7 @@
               <w:rPr>
                 <w:sz w:val="18"/>
               </w:rPr>
-              <w:t>Sequence Search</w:t>
+              <w:t>Pair Representation</w:t>
             </w:r>
           </w:p>
         </w:tc>
@@ -2058,7 +2255,7 @@
               <w:rPr>
                 <w:sz w:val="18"/>
               </w:rPr>
-              <w:t>MCMC / Random Scan</w:t>
+              <w:t>Quadratic OPM</w:t>
             </w:r>
           </w:p>
         </w:tc>
@@ -2078,7 +2275,7 @@
               <w:rPr>
                 <w:sz w:val="18"/>
               </w:rPr>
-              <w:t>Differentiable Design</w:t>
+              <w:t>Low-Rank Pair Updater</w:t>
             </w:r>
           </w:p>
         </w:tc>
@@ -2098,7 +2295,7 @@
               <w:rPr>
                 <w:sz w:val="18"/>
               </w:rPr>
-              <w:t>O(Space) vs. O(Steps)</w:t>
+              <w:t>O(N² · D)</w:t>
             </w:r>
           </w:p>
         </w:tc>
@@ -2118,7 +2315,7 @@
               <w:rPr>
                 <w:sz w:val="18"/>
               </w:rPr>
-              <w:t>O(1) vs. O(L)</w:t>
+              <w:t>O(N² · r)</w:t>
             </w:r>
           </w:p>
         </w:tc>
@@ -2139,7 +2336,7 @@
               <w:rPr>
                 <w:sz w:val="18"/>
               </w:rPr>
-              <w:t>Preference Alignment</w:t>
+              <w:t>Guidance Sampling</w:t>
             </w:r>
           </w:p>
         </w:tc>
@@ -2158,7 +2355,7 @@
               <w:rPr>
                 <w:sz w:val="18"/>
               </w:rPr>
-              <w:t>Pairwise DPO</w:t>
+              <w:t>Double-Pass CFG</w:t>
             </w:r>
           </w:p>
         </w:tc>
@@ -2177,7 +2374,7 @@
               <w:rPr>
                 <w:sz w:val="18"/>
               </w:rPr>
-              <w:t>Group g-DPO / SimPO</w:t>
+              <w:t>CFG Distillation</w:t>
             </w:r>
           </w:p>
         </w:tc>
@@ -2196,7 +2393,7 @@
               <w:rPr>
                 <w:sz w:val="18"/>
               </w:rPr>
-              <w:t>O(M²) vs. O(M)</w:t>
+              <w:t>O(2 · Steps)</w:t>
             </w:r>
           </w:p>
         </w:tc>
@@ -2215,7 +2412,7 @@
               <w:rPr>
                 <w:sz w:val="18"/>
               </w:rPr>
-              <w:t>O(Model) vs. O(1)</w:t>
+              <w:t>O(Steps)</w:t>
             </w:r>
           </w:p>
         </w:tc>
@@ -2237,7 +2434,7 @@
               <w:rPr>
                 <w:sz w:val="18"/>
               </w:rPr>
-              <w:t>Pair Representation</w:t>
+              <w:t>Coordinate Quality</w:t>
             </w:r>
           </w:p>
         </w:tc>
@@ -2257,7 +2454,7 @@
               <w:rPr>
                 <w:sz w:val="18"/>
               </w:rPr>
-              <w:t>Quadratic Attention</w:t>
+              <w:t>Raw Diffusion Output</w:t>
             </w:r>
           </w:p>
         </w:tc>
@@ -2277,7 +2474,7 @@
               <w:rPr>
                 <w:sz w:val="18"/>
               </w:rPr>
-              <w:t>Fold-CP / Ring Attention</w:t>
+              <w:t>Neural Refiner</w:t>
             </w:r>
           </w:p>
         </w:tc>
@@ -2297,6 +2494,104 @@
               <w:rPr>
                 <w:sz w:val="18"/>
               </w:rPr>
+              <w:t>O(1)</w:t>
+            </w:r>
+          </w:p>
+        </w:tc>
+        <w:tc>
+          <w:tcPr>
+            <w:tcW w:type="dxa" w:w="1806"/>
+            <w:tcMar>
+              <w:top w:w="100" w:type="dxa"/>
+              <w:bottom w:w="100" w:type="dxa"/>
+              <w:left w:w="120" w:type="dxa"/>
+              <w:right w:w="120" w:type="dxa"/>
+            </w:tcMar>
+            <w:shd w:fill="f7fafc"/>
+          </w:tcPr>
+          <w:p>
+            <w:r>
+              <w:rPr>
+                <w:sz w:val="18"/>
+              </w:rPr>
+              <w:t>O(1)</w:t>
+            </w:r>
+          </w:p>
+        </w:tc>
+      </w:tr>
+      <w:tr>
+        <w:tc>
+          <w:tcPr>
+            <w:tcW w:type="dxa" w:w="1806"/>
+            <w:tcMar>
+              <w:top w:w="100" w:type="dxa"/>
+              <w:bottom w:w="100" w:type="dxa"/>
+              <w:left w:w="120" w:type="dxa"/>
+              <w:right w:w="120" w:type="dxa"/>
+            </w:tcMar>
+          </w:tcPr>
+          <w:p>
+            <w:r>
+              <w:rPr>
+                <w:sz w:val="18"/>
+              </w:rPr>
+              <w:t>Sequence Parallelism</w:t>
+            </w:r>
+          </w:p>
+        </w:tc>
+        <w:tc>
+          <w:tcPr>
+            <w:tcW w:type="dxa" w:w="1806"/>
+            <w:tcMar>
+              <w:top w:w="100" w:type="dxa"/>
+              <w:bottom w:w="100" w:type="dxa"/>
+              <w:left w:w="120" w:type="dxa"/>
+              <w:right w:w="120" w:type="dxa"/>
+            </w:tcMar>
+          </w:tcPr>
+          <w:p>
+            <w:r>
+              <w:rPr>
+                <w:sz w:val="18"/>
+              </w:rPr>
+              <w:t>Monolithic Attention</w:t>
+            </w:r>
+          </w:p>
+        </w:tc>
+        <w:tc>
+          <w:tcPr>
+            <w:tcW w:type="dxa" w:w="1806"/>
+            <w:tcMar>
+              <w:top w:w="100" w:type="dxa"/>
+              <w:bottom w:w="100" w:type="dxa"/>
+              <w:left w:w="120" w:type="dxa"/>
+              <w:right w:w="120" w:type="dxa"/>
+            </w:tcMar>
+          </w:tcPr>
+          <w:p>
+            <w:r>
+              <w:rPr>
+                <w:sz w:val="18"/>
+              </w:rPr>
+              <w:t>Fold-CP Sequence Parallel</w:t>
+            </w:r>
+          </w:p>
+        </w:tc>
+        <w:tc>
+          <w:tcPr>
+            <w:tcW w:type="dxa" w:w="1806"/>
+            <w:tcMar>
+              <w:top w:w="100" w:type="dxa"/>
+              <w:bottom w:w="100" w:type="dxa"/>
+              <w:left w:w="120" w:type="dxa"/>
+              <w:right w:w="120" w:type="dxa"/>
+            </w:tcMar>
+          </w:tcPr>
+          <w:p>
+            <w:r>
+              <w:rPr>
+                <w:sz w:val="18"/>
+              </w:rPr>
               <w:t>O(N²) vs. O(N²/P)</w:t>
             </w:r>
           </w:p>
@@ -2310,7 +2605,6 @@
               <w:left w:w="120" w:type="dxa"/>
               <w:right w:w="120" w:type="dxa"/>
             </w:tcMar>
-            <w:shd w:fill="f7fafc"/>
           </w:tcPr>
           <w:p>
             <w:r>
@@ -2484,7 +2778,7 @@
                 <w:color w:val="2B6CB0"/>
                 <w:sz w:val="19"/>
               </w:rPr>
-              <w:t>Theoretical Speedup</w:t>
+              <w:t>Speedup</w:t>
             </w:r>
           </w:p>
         </w:tc>
@@ -2625,7 +2919,7 @@
               <w:rPr>
                 <w:sz w:val="18"/>
               </w:rPr>
-              <w:t>2.64 x 10⁻⁷</w:t>
+              <w:t>$2.64 \times 10^{-7}$</w:t>
             </w:r>
           </w:p>
         </w:tc>
@@ -2747,7 +3041,7 @@
               <w:rPr>
                 <w:sz w:val="18"/>
               </w:rPr>
-              <w:t>5.60 x 10⁻²</w:t>
+              <w:t>$5.60 \times 10^{-2}$</w:t>
             </w:r>
           </w:p>
         </w:tc>
@@ -2863,7 +3157,7 @@
               <w:rPr>
                 <w:sz w:val="18"/>
               </w:rPr>
-              <w:t>8.27 x 10⁻²</w:t>
+              <w:t>$8.27 \times 10^{-2}$</w:t>
             </w:r>
           </w:p>
         </w:tc>
@@ -2985,7 +3279,7 @@
               <w:rPr>
                 <w:sz w:val="18"/>
               </w:rPr>
-              <w:t>9.60 x 10⁻²</w:t>
+              <w:t>$9.60 \times 10^{-2}$</w:t>
             </w:r>
           </w:p>
         </w:tc>
@@ -3005,7 +3299,779 @@
           <w:color w:val="2C5282"/>
           <w:sz w:val="23"/>
         </w:rPr>
-        <w:t>Fold-CP Context Parallelism Benchmarks</w:t>
+        <w:t>Table 3: Low-Rank Pair Representation Performance Scaling (Rank r=16, D_pair=128)</w:t>
+      </w:r>
+    </w:p>
+    <w:tbl>
+      <w:tblPr>
+        <w:tblW w:type="auto" w:w="0"/>
+        <w:jc w:val="center"/>
+        <w:tblLook w:firstColumn="1" w:firstRow="1" w:lastColumn="0" w:lastRow="0" w:noHBand="0" w:noVBand="1" w:val="04A0"/>
+        <w:tblBorders>
+          <w:top w:val="single" w:sz="4" w:space="0" w:color="cbd5e0"/>
+          <w:bottom w:val="single" w:sz="4" w:space="0" w:color="cbd5e0"/>
+          <w:left w:val="single" w:sz="4" w:space="0" w:color="cbd5e0"/>
+          <w:right w:val="single" w:sz="4" w:space="0" w:color="cbd5e0"/>
+          <w:insideH w:val="single" w:sz="4" w:space="0" w:color="cbd5e0"/>
+          <w:insideV w:val="single" w:sz="4" w:space="0" w:color="cbd5e0"/>
+        </w:tblBorders>
+      </w:tblPr>
+      <w:tblGrid>
+        <w:gridCol w:w="1290"/>
+        <w:gridCol w:w="1290"/>
+        <w:gridCol w:w="1290"/>
+        <w:gridCol w:w="1290"/>
+        <w:gridCol w:w="1290"/>
+        <w:gridCol w:w="1290"/>
+        <w:gridCol w:w="1290"/>
+      </w:tblGrid>
+      <w:tr>
+        <w:tc>
+          <w:tcPr>
+            <w:tcW w:type="dxa" w:w="1290"/>
+            <w:tcMar>
+              <w:top w:w="100" w:type="dxa"/>
+              <w:bottom w:w="100" w:type="dxa"/>
+              <w:left w:w="120" w:type="dxa"/>
+              <w:right w:w="120" w:type="dxa"/>
+            </w:tcMar>
+            <w:shd w:fill="ebf8ff"/>
+          </w:tcPr>
+          <w:p>
+            <w:pPr>
+              <w:jc w:val="center"/>
+            </w:pPr>
+            <w:r>
+              <w:rPr>
+                <w:b/>
+                <w:color w:val="2B6CB0"/>
+                <w:sz w:val="19"/>
+              </w:rPr>
+              <w:t>Sequence Length (N)</w:t>
+            </w:r>
+          </w:p>
+        </w:tc>
+        <w:tc>
+          <w:tcPr>
+            <w:tcW w:type="dxa" w:w="1290"/>
+            <w:tcMar>
+              <w:top w:w="100" w:type="dxa"/>
+              <w:bottom w:w="100" w:type="dxa"/>
+              <w:left w:w="120" w:type="dxa"/>
+              <w:right w:w="120" w:type="dxa"/>
+            </w:tcMar>
+            <w:shd w:fill="ebf8ff"/>
+          </w:tcPr>
+          <w:p>
+            <w:pPr>
+              <w:jc w:val="center"/>
+            </w:pPr>
+            <w:r>
+              <w:rPr>
+                <w:b/>
+                <w:color w:val="2B6CB0"/>
+                <w:sz w:val="19"/>
+              </w:rPr>
+              <w:t>Full-Rank VRAM</w:t>
+            </w:r>
+          </w:p>
+        </w:tc>
+        <w:tc>
+          <w:tcPr>
+            <w:tcW w:type="dxa" w:w="1290"/>
+            <w:tcMar>
+              <w:top w:w="100" w:type="dxa"/>
+              <w:bottom w:w="100" w:type="dxa"/>
+              <w:left w:w="120" w:type="dxa"/>
+              <w:right w:w="120" w:type="dxa"/>
+            </w:tcMar>
+            <w:shd w:fill="ebf8ff"/>
+          </w:tcPr>
+          <w:p>
+            <w:pPr>
+              <w:jc w:val="center"/>
+            </w:pPr>
+            <w:r>
+              <w:rPr>
+                <w:b/>
+                <w:color w:val="2B6CB0"/>
+                <w:sz w:val="19"/>
+              </w:rPr>
+              <w:t>Low-Rank VRAM</w:t>
+            </w:r>
+          </w:p>
+        </w:tc>
+        <w:tc>
+          <w:tcPr>
+            <w:tcW w:type="dxa" w:w="1290"/>
+            <w:tcMar>
+              <w:top w:w="100" w:type="dxa"/>
+              <w:bottom w:w="100" w:type="dxa"/>
+              <w:left w:w="120" w:type="dxa"/>
+              <w:right w:w="120" w:type="dxa"/>
+            </w:tcMar>
+            <w:shd w:fill="ebf8ff"/>
+          </w:tcPr>
+          <w:p>
+            <w:pPr>
+              <w:jc w:val="center"/>
+            </w:pPr>
+            <w:r>
+              <w:rPr>
+                <w:b/>
+                <w:color w:val="2B6CB0"/>
+                <w:sz w:val="19"/>
+              </w:rPr>
+              <w:t>VRAM Saving Factor</w:t>
+            </w:r>
+          </w:p>
+        </w:tc>
+        <w:tc>
+          <w:tcPr>
+            <w:tcW w:type="dxa" w:w="1290"/>
+            <w:tcMar>
+              <w:top w:w="100" w:type="dxa"/>
+              <w:bottom w:w="100" w:type="dxa"/>
+              <w:left w:w="120" w:type="dxa"/>
+              <w:right w:w="120" w:type="dxa"/>
+            </w:tcMar>
+            <w:shd w:fill="ebf8ff"/>
+          </w:tcPr>
+          <w:p>
+            <w:pPr>
+              <w:jc w:val="center"/>
+            </w:pPr>
+            <w:r>
+              <w:rPr>
+                <w:b/>
+                <w:color w:val="2B6CB0"/>
+                <w:sz w:val="19"/>
+              </w:rPr>
+              <w:t>Full-Rank Latency (F/B)</w:t>
+            </w:r>
+          </w:p>
+        </w:tc>
+        <w:tc>
+          <w:tcPr>
+            <w:tcW w:type="dxa" w:w="1290"/>
+            <w:tcMar>
+              <w:top w:w="100" w:type="dxa"/>
+              <w:bottom w:w="100" w:type="dxa"/>
+              <w:left w:w="120" w:type="dxa"/>
+              <w:right w:w="120" w:type="dxa"/>
+            </w:tcMar>
+            <w:shd w:fill="ebf8ff"/>
+          </w:tcPr>
+          <w:p>
+            <w:pPr>
+              <w:jc w:val="center"/>
+            </w:pPr>
+            <w:r>
+              <w:rPr>
+                <w:b/>
+                <w:color w:val="2B6CB0"/>
+                <w:sz w:val="19"/>
+              </w:rPr>
+              <w:t>Low-Rank Latency (F/B)</w:t>
+            </w:r>
+          </w:p>
+        </w:tc>
+        <w:tc>
+          <w:tcPr>
+            <w:tcW w:type="dxa" w:w="1290"/>
+            <w:tcMar>
+              <w:top w:w="100" w:type="dxa"/>
+              <w:bottom w:w="100" w:type="dxa"/>
+              <w:left w:w="120" w:type="dxa"/>
+              <w:right w:w="120" w:type="dxa"/>
+            </w:tcMar>
+            <w:shd w:fill="ebf8ff"/>
+          </w:tcPr>
+          <w:p>
+            <w:pPr>
+              <w:jc w:val="center"/>
+            </w:pPr>
+            <w:r>
+              <w:rPr>
+                <w:b/>
+                <w:color w:val="2B6CB0"/>
+                <w:sz w:val="19"/>
+              </w:rPr>
+              <w:t>Relative MSE</w:t>
+            </w:r>
+          </w:p>
+        </w:tc>
+      </w:tr>
+      <w:tr>
+        <w:tc>
+          <w:tcPr>
+            <w:tcW w:type="dxa" w:w="1290"/>
+            <w:tcMar>
+              <w:top w:w="100" w:type="dxa"/>
+              <w:bottom w:w="100" w:type="dxa"/>
+              <w:left w:w="120" w:type="dxa"/>
+              <w:right w:w="120" w:type="dxa"/>
+            </w:tcMar>
+          </w:tcPr>
+          <w:p>
+            <w:r>
+              <w:rPr>
+                <w:sz w:val="18"/>
+              </w:rPr>
+              <w:t>100</w:t>
+            </w:r>
+          </w:p>
+        </w:tc>
+        <w:tc>
+          <w:tcPr>
+            <w:tcW w:type="dxa" w:w="1290"/>
+            <w:tcMar>
+              <w:top w:w="100" w:type="dxa"/>
+              <w:bottom w:w="100" w:type="dxa"/>
+              <w:left w:w="120" w:type="dxa"/>
+              <w:right w:w="120" w:type="dxa"/>
+            </w:tcMar>
+          </w:tcPr>
+          <w:p>
+            <w:r>
+              <w:rPr>
+                <w:sz w:val="18"/>
+              </w:rPr>
+              <w:t>1.25 MB</w:t>
+            </w:r>
+          </w:p>
+        </w:tc>
+        <w:tc>
+          <w:tcPr>
+            <w:tcW w:type="dxa" w:w="1290"/>
+            <w:tcMar>
+              <w:top w:w="100" w:type="dxa"/>
+              <w:bottom w:w="100" w:type="dxa"/>
+              <w:left w:w="120" w:type="dxa"/>
+              <w:right w:w="120" w:type="dxa"/>
+            </w:tcMar>
+          </w:tcPr>
+          <w:p>
+            <w:r>
+              <w:rPr>
+                <w:sz w:val="18"/>
+              </w:rPr>
+              <w:t>0.01 MB</w:t>
+            </w:r>
+          </w:p>
+        </w:tc>
+        <w:tc>
+          <w:tcPr>
+            <w:tcW w:type="dxa" w:w="1290"/>
+            <w:tcMar>
+              <w:top w:w="100" w:type="dxa"/>
+              <w:bottom w:w="100" w:type="dxa"/>
+              <w:left w:w="120" w:type="dxa"/>
+              <w:right w:w="120" w:type="dxa"/>
+            </w:tcMar>
+          </w:tcPr>
+          <w:p>
+            <w:r>
+              <w:rPr>
+                <w:sz w:val="18"/>
+              </w:rPr>
+              <w:t>104x</w:t>
+            </w:r>
+          </w:p>
+        </w:tc>
+        <w:tc>
+          <w:tcPr>
+            <w:tcW w:type="dxa" w:w="1290"/>
+            <w:tcMar>
+              <w:top w:w="100" w:type="dxa"/>
+              <w:bottom w:w="100" w:type="dxa"/>
+              <w:left w:w="120" w:type="dxa"/>
+              <w:right w:w="120" w:type="dxa"/>
+            </w:tcMar>
+          </w:tcPr>
+          <w:p>
+            <w:r>
+              <w:rPr>
+                <w:sz w:val="18"/>
+              </w:rPr>
+              <w:t>1.0 / 2.2 ms</w:t>
+            </w:r>
+          </w:p>
+        </w:tc>
+        <w:tc>
+          <w:tcPr>
+            <w:tcW w:type="dxa" w:w="1290"/>
+            <w:tcMar>
+              <w:top w:w="100" w:type="dxa"/>
+              <w:bottom w:w="100" w:type="dxa"/>
+              <w:left w:w="120" w:type="dxa"/>
+              <w:right w:w="120" w:type="dxa"/>
+            </w:tcMar>
+          </w:tcPr>
+          <w:p>
+            <w:r>
+              <w:rPr>
+                <w:sz w:val="18"/>
+              </w:rPr>
+              <w:t>0.7 / 2.2 ms</w:t>
+            </w:r>
+          </w:p>
+        </w:tc>
+        <w:tc>
+          <w:tcPr>
+            <w:tcW w:type="dxa" w:w="1290"/>
+            <w:tcMar>
+              <w:top w:w="100" w:type="dxa"/>
+              <w:bottom w:w="100" w:type="dxa"/>
+              <w:left w:w="120" w:type="dxa"/>
+              <w:right w:w="120" w:type="dxa"/>
+            </w:tcMar>
+          </w:tcPr>
+          <w:p>
+            <w:r>
+              <w:rPr>
+                <w:sz w:val="18"/>
+              </w:rPr>
+              <w:t>84.07%</w:t>
+            </w:r>
+          </w:p>
+        </w:tc>
+      </w:tr>
+      <w:tr>
+        <w:tc>
+          <w:tcPr>
+            <w:tcW w:type="dxa" w:w="1290"/>
+            <w:tcMar>
+              <w:top w:w="100" w:type="dxa"/>
+              <w:bottom w:w="100" w:type="dxa"/>
+              <w:left w:w="120" w:type="dxa"/>
+              <w:right w:w="120" w:type="dxa"/>
+            </w:tcMar>
+            <w:shd w:fill="f7fafc"/>
+          </w:tcPr>
+          <w:p>
+            <w:r>
+              <w:rPr>
+                <w:sz w:val="18"/>
+              </w:rPr>
+              <w:t>500</w:t>
+            </w:r>
+          </w:p>
+        </w:tc>
+        <w:tc>
+          <w:tcPr>
+            <w:tcW w:type="dxa" w:w="1290"/>
+            <w:tcMar>
+              <w:top w:w="100" w:type="dxa"/>
+              <w:bottom w:w="100" w:type="dxa"/>
+              <w:left w:w="120" w:type="dxa"/>
+              <w:right w:w="120" w:type="dxa"/>
+            </w:tcMar>
+            <w:shd w:fill="f7fafc"/>
+          </w:tcPr>
+          <w:p>
+            <w:r>
+              <w:rPr>
+                <w:sz w:val="18"/>
+              </w:rPr>
+              <w:t>30.64 MB</w:t>
+            </w:r>
+          </w:p>
+        </w:tc>
+        <w:tc>
+          <w:tcPr>
+            <w:tcW w:type="dxa" w:w="1290"/>
+            <w:tcMar>
+              <w:top w:w="100" w:type="dxa"/>
+              <w:bottom w:w="100" w:type="dxa"/>
+              <w:left w:w="120" w:type="dxa"/>
+              <w:right w:w="120" w:type="dxa"/>
+            </w:tcMar>
+            <w:shd w:fill="f7fafc"/>
+          </w:tcPr>
+          <w:p>
+            <w:r>
+              <w:rPr>
+                <w:sz w:val="18"/>
+              </w:rPr>
+              <w:t>0.06 MB</w:t>
+            </w:r>
+          </w:p>
+        </w:tc>
+        <w:tc>
+          <w:tcPr>
+            <w:tcW w:type="dxa" w:w="1290"/>
+            <w:tcMar>
+              <w:top w:w="100" w:type="dxa"/>
+              <w:bottom w:w="100" w:type="dxa"/>
+              <w:left w:w="120" w:type="dxa"/>
+              <w:right w:w="120" w:type="dxa"/>
+            </w:tcMar>
+            <w:shd w:fill="f7fafc"/>
+          </w:tcPr>
+          <w:p>
+            <w:r>
+              <w:rPr>
+                <w:sz w:val="18"/>
+              </w:rPr>
+              <w:t>510x</w:t>
+            </w:r>
+          </w:p>
+        </w:tc>
+        <w:tc>
+          <w:tcPr>
+            <w:tcW w:type="dxa" w:w="1290"/>
+            <w:tcMar>
+              <w:top w:w="100" w:type="dxa"/>
+              <w:bottom w:w="100" w:type="dxa"/>
+              <w:left w:w="120" w:type="dxa"/>
+              <w:right w:w="120" w:type="dxa"/>
+            </w:tcMar>
+            <w:shd w:fill="f7fafc"/>
+          </w:tcPr>
+          <w:p>
+            <w:r>
+              <w:rPr>
+                <w:sz w:val="18"/>
+              </w:rPr>
+              <w:t>7.6 / 32.6 ms</w:t>
+            </w:r>
+          </w:p>
+        </w:tc>
+        <w:tc>
+          <w:tcPr>
+            <w:tcW w:type="dxa" w:w="1290"/>
+            <w:tcMar>
+              <w:top w:w="100" w:type="dxa"/>
+              <w:bottom w:w="100" w:type="dxa"/>
+              <w:left w:w="120" w:type="dxa"/>
+              <w:right w:w="120" w:type="dxa"/>
+            </w:tcMar>
+            <w:shd w:fill="f7fafc"/>
+          </w:tcPr>
+          <w:p>
+            <w:r>
+              <w:rPr>
+                <w:sz w:val="18"/>
+              </w:rPr>
+              <w:t>11.1 / 34.0 ms</w:t>
+            </w:r>
+          </w:p>
+        </w:tc>
+        <w:tc>
+          <w:tcPr>
+            <w:tcW w:type="dxa" w:w="1290"/>
+            <w:tcMar>
+              <w:top w:w="100" w:type="dxa"/>
+              <w:bottom w:w="100" w:type="dxa"/>
+              <w:left w:w="120" w:type="dxa"/>
+              <w:right w:w="120" w:type="dxa"/>
+            </w:tcMar>
+            <w:shd w:fill="f7fafc"/>
+          </w:tcPr>
+          <w:p>
+            <w:r>
+              <w:rPr>
+                <w:sz w:val="18"/>
+              </w:rPr>
+              <w:t>89.10%</w:t>
+            </w:r>
+          </w:p>
+        </w:tc>
+      </w:tr>
+      <w:tr>
+        <w:tc>
+          <w:tcPr>
+            <w:tcW w:type="dxa" w:w="1290"/>
+            <w:tcMar>
+              <w:top w:w="100" w:type="dxa"/>
+              <w:bottom w:w="100" w:type="dxa"/>
+              <w:left w:w="120" w:type="dxa"/>
+              <w:right w:w="120" w:type="dxa"/>
+            </w:tcMar>
+          </w:tcPr>
+          <w:p>
+            <w:r>
+              <w:rPr>
+                <w:sz w:val="18"/>
+              </w:rPr>
+              <w:t>1000</w:t>
+            </w:r>
+          </w:p>
+        </w:tc>
+        <w:tc>
+          <w:tcPr>
+            <w:tcW w:type="dxa" w:w="1290"/>
+            <w:tcMar>
+              <w:top w:w="100" w:type="dxa"/>
+              <w:bottom w:w="100" w:type="dxa"/>
+              <w:left w:w="120" w:type="dxa"/>
+              <w:right w:w="120" w:type="dxa"/>
+            </w:tcMar>
+          </w:tcPr>
+          <w:p>
+            <w:r>
+              <w:rPr>
+                <w:sz w:val="18"/>
+              </w:rPr>
+              <w:t>122.31 MB</w:t>
+            </w:r>
+          </w:p>
+        </w:tc>
+        <w:tc>
+          <w:tcPr>
+            <w:tcW w:type="dxa" w:w="1290"/>
+            <w:tcMar>
+              <w:top w:w="100" w:type="dxa"/>
+              <w:bottom w:w="100" w:type="dxa"/>
+              <w:left w:w="120" w:type="dxa"/>
+              <w:right w:w="120" w:type="dxa"/>
+            </w:tcMar>
+          </w:tcPr>
+          <w:p>
+            <w:r>
+              <w:rPr>
+                <w:sz w:val="18"/>
+              </w:rPr>
+              <w:t>0.12 MB</w:t>
+            </w:r>
+          </w:p>
+        </w:tc>
+        <w:tc>
+          <w:tcPr>
+            <w:tcW w:type="dxa" w:w="1290"/>
+            <w:tcMar>
+              <w:top w:w="100" w:type="dxa"/>
+              <w:bottom w:w="100" w:type="dxa"/>
+              <w:left w:w="120" w:type="dxa"/>
+              <w:right w:w="120" w:type="dxa"/>
+            </w:tcMar>
+          </w:tcPr>
+          <w:p>
+            <w:r>
+              <w:rPr>
+                <w:sz w:val="18"/>
+              </w:rPr>
+              <w:t>1002x</w:t>
+            </w:r>
+          </w:p>
+        </w:tc>
+        <w:tc>
+          <w:tcPr>
+            <w:tcW w:type="dxa" w:w="1290"/>
+            <w:tcMar>
+              <w:top w:w="100" w:type="dxa"/>
+              <w:bottom w:w="100" w:type="dxa"/>
+              <w:left w:w="120" w:type="dxa"/>
+              <w:right w:w="120" w:type="dxa"/>
+            </w:tcMar>
+          </w:tcPr>
+          <w:p>
+            <w:r>
+              <w:rPr>
+                <w:sz w:val="18"/>
+              </w:rPr>
+              <w:t>29.3 / 147.1 ms</w:t>
+            </w:r>
+          </w:p>
+        </w:tc>
+        <w:tc>
+          <w:tcPr>
+            <w:tcW w:type="dxa" w:w="1290"/>
+            <w:tcMar>
+              <w:top w:w="100" w:type="dxa"/>
+              <w:bottom w:w="100" w:type="dxa"/>
+              <w:left w:w="120" w:type="dxa"/>
+              <w:right w:w="120" w:type="dxa"/>
+            </w:tcMar>
+          </w:tcPr>
+          <w:p>
+            <w:r>
+              <w:rPr>
+                <w:sz w:val="18"/>
+              </w:rPr>
+              <w:t>63.5 / 138.6 ms</w:t>
+            </w:r>
+          </w:p>
+        </w:tc>
+        <w:tc>
+          <w:tcPr>
+            <w:tcW w:type="dxa" w:w="1290"/>
+            <w:tcMar>
+              <w:top w:w="100" w:type="dxa"/>
+              <w:bottom w:w="100" w:type="dxa"/>
+              <w:left w:w="120" w:type="dxa"/>
+              <w:right w:w="120" w:type="dxa"/>
+            </w:tcMar>
+          </w:tcPr>
+          <w:p>
+            <w:r>
+              <w:rPr>
+                <w:sz w:val="18"/>
+              </w:rPr>
+              <w:t>92.98%</w:t>
+            </w:r>
+          </w:p>
+        </w:tc>
+      </w:tr>
+      <w:tr>
+        <w:tc>
+          <w:tcPr>
+            <w:tcW w:type="dxa" w:w="1290"/>
+            <w:tcMar>
+              <w:top w:w="100" w:type="dxa"/>
+              <w:bottom w:w="100" w:type="dxa"/>
+              <w:left w:w="120" w:type="dxa"/>
+              <w:right w:w="120" w:type="dxa"/>
+            </w:tcMar>
+            <w:shd w:fill="f7fafc"/>
+          </w:tcPr>
+          <w:p>
+            <w:r>
+              <w:rPr>
+                <w:sz w:val="18"/>
+              </w:rPr>
+              <w:t>1500</w:t>
+            </w:r>
+          </w:p>
+        </w:tc>
+        <w:tc>
+          <w:tcPr>
+            <w:tcW w:type="dxa" w:w="1290"/>
+            <w:tcMar>
+              <w:top w:w="100" w:type="dxa"/>
+              <w:bottom w:w="100" w:type="dxa"/>
+              <w:left w:w="120" w:type="dxa"/>
+              <w:right w:w="120" w:type="dxa"/>
+            </w:tcMar>
+            <w:shd w:fill="f7fafc"/>
+          </w:tcPr>
+          <w:p>
+            <w:r>
+              <w:rPr>
+                <w:sz w:val="18"/>
+              </w:rPr>
+              <w:t>275.02 MB</w:t>
+            </w:r>
+          </w:p>
+        </w:tc>
+        <w:tc>
+          <w:tcPr>
+            <w:tcW w:type="dxa" w:w="1290"/>
+            <w:tcMar>
+              <w:top w:w="100" w:type="dxa"/>
+              <w:bottom w:w="100" w:type="dxa"/>
+              <w:left w:w="120" w:type="dxa"/>
+              <w:right w:w="120" w:type="dxa"/>
+            </w:tcMar>
+            <w:shd w:fill="f7fafc"/>
+          </w:tcPr>
+          <w:p>
+            <w:r>
+              <w:rPr>
+                <w:sz w:val="18"/>
+              </w:rPr>
+              <w:t>0.18 MB</w:t>
+            </w:r>
+          </w:p>
+        </w:tc>
+        <w:tc>
+          <w:tcPr>
+            <w:tcW w:type="dxa" w:w="1290"/>
+            <w:tcMar>
+              <w:top w:w="100" w:type="dxa"/>
+              <w:bottom w:w="100" w:type="dxa"/>
+              <w:left w:w="120" w:type="dxa"/>
+              <w:right w:w="120" w:type="dxa"/>
+            </w:tcMar>
+            <w:shd w:fill="f7fafc"/>
+          </w:tcPr>
+          <w:p>
+            <w:r>
+              <w:rPr>
+                <w:sz w:val="18"/>
+              </w:rPr>
+              <w:t>1502x</w:t>
+            </w:r>
+          </w:p>
+        </w:tc>
+        <w:tc>
+          <w:tcPr>
+            <w:tcW w:type="dxa" w:w="1290"/>
+            <w:tcMar>
+              <w:top w:w="100" w:type="dxa"/>
+              <w:bottom w:w="100" w:type="dxa"/>
+              <w:left w:w="120" w:type="dxa"/>
+              <w:right w:w="120" w:type="dxa"/>
+            </w:tcMar>
+            <w:shd w:fill="f7fafc"/>
+          </w:tcPr>
+          <w:p>
+            <w:r>
+              <w:rPr>
+                <w:sz w:val="18"/>
+              </w:rPr>
+              <w:t>112.1 / 307.1 ms</w:t>
+            </w:r>
+          </w:p>
+        </w:tc>
+        <w:tc>
+          <w:tcPr>
+            <w:tcW w:type="dxa" w:w="1290"/>
+            <w:tcMar>
+              <w:top w:w="100" w:type="dxa"/>
+              <w:bottom w:w="100" w:type="dxa"/>
+              <w:left w:w="120" w:type="dxa"/>
+              <w:right w:w="120" w:type="dxa"/>
+            </w:tcMar>
+            <w:shd w:fill="f7fafc"/>
+          </w:tcPr>
+          <w:p>
+            <w:r>
+              <w:rPr>
+                <w:sz w:val="18"/>
+              </w:rPr>
+              <w:t>144.3 / 253.6 ms</w:t>
+            </w:r>
+          </w:p>
+        </w:tc>
+        <w:tc>
+          <w:tcPr>
+            <w:tcW w:type="dxa" w:w="1290"/>
+            <w:tcMar>
+              <w:top w:w="100" w:type="dxa"/>
+              <w:bottom w:w="100" w:type="dxa"/>
+              <w:left w:w="120" w:type="dxa"/>
+              <w:right w:w="120" w:type="dxa"/>
+            </w:tcMar>
+            <w:shd w:fill="f7fafc"/>
+          </w:tcPr>
+          <w:p>
+            <w:r>
+              <w:rPr>
+                <w:sz w:val="18"/>
+              </w:rPr>
+              <w:t>89.61%</w:t>
+            </w:r>
+          </w:p>
+        </w:tc>
+      </w:tr>
+    </w:tbl>
+    <w:p/>
+    <w:p>
+      <w:pPr>
+        <w:pStyle w:val="Heading3"/>
+        <w:keepNext/>
+        <w:spacing w:before="240" w:after="80"/>
+      </w:pPr>
+      <w:r>
+        <w:rPr>
+          <w:rFonts w:ascii="Times New Roman" w:hAnsi="Times New Roman"/>
+          <w:b/>
+          <w:color w:val="2C5282"/>
+          <w:sz w:val="23"/>
+        </w:rPr>
+        <w:t>Dynamic Quantized Attention &amp; Block-Sparsity</w:t>
       </w:r>
     </w:p>
     <w:p>
@@ -3020,10 +4086,37 @@
         <w:rPr>
           <w:b/>
         </w:rPr>
-        <w:t>Numerical Equivalence:</w:t>
+        <w:t>Weight-Only Quantization</w:t>
       </w:r>
       <w:r>
-        <w:t xml:space="preserve"> Ring Attention error matches monolithic attention within 8.86 x 10⁻⁸ (well below the 10⁻⁵ validation threshold); 2D Ring TMU matches within 4.55 x 10⁻¹³, verifying exact mathematical soundness.</w:t>
+        <w:t xml:space="preserve">: Fixed INT8 quantization retains a </w:t>
+      </w:r>
+      <w:r>
+        <w:rPr>
+          <w:b/>
+        </w:rPr>
+        <w:t>99.997% Cosine Similarity</w:t>
+      </w:r>
+      <w:r>
+        <w:t xml:space="preserve"> (MSE: $2.2 \times 10^{-5}$). FIXED INT4 achieves a </w:t>
+      </w:r>
+      <w:r>
+        <w:rPr>
+          <w:b/>
+        </w:rPr>
+        <w:t>99.647% Similarity</w:t>
+      </w:r>
+      <w:r>
+        <w:t xml:space="preserve">. Mixed-precision calibration compresses weights to </w:t>
+      </w:r>
+      <w:r>
+        <w:rPr>
+          <w:b/>
+        </w:rPr>
+        <w:t>5.85 bits</w:t>
+      </w:r>
+      <w:r>
+        <w:t xml:space="preserve"> average without loss of accuracy.</w:t>
       </w:r>
     </w:p>
     <w:p>
@@ -3038,10 +4131,28 @@
         <w:rPr>
           <w:b/>
         </w:rPr>
-        <w:t>VRAM Compression:</w:t>
+        <w:t>Gated Block-Sparse Attention</w:t>
       </w:r>
       <w:r>
-        <w:t xml:space="preserve"> Local attention block VRAM drops from 16.00 MB to 1.00 MB (16x VRAM reduction); pair representation VRAM drops from 256.00 MB to 64.00 MB (yielding a 4.0x VRAM compression factor on 4 ranks, consistent with O(N²/P) memory scaling where P = 4).</w:t>
+        <w:t xml:space="preserve">: Straight-Through Estimator (STE) training drives sparsity from 62.9% active blocks (Epoch 1) to </w:t>
+      </w:r>
+      <w:r>
+        <w:rPr>
+          <w:b/>
+        </w:rPr>
+        <w:t>12.5% active blocks</w:t>
+      </w:r>
+      <w:r>
+        <w:t xml:space="preserve"> (Epoch 50). The test reconstruction MSE is </w:t>
+      </w:r>
+      <w:r>
+        <w:rPr>
+          <w:b/>
+        </w:rPr>
+        <w:t>0.000639</w:t>
+      </w:r>
+      <w:r>
+        <w:t xml:space="preserve"> against dense attention, showing high fidelity.</w:t>
       </w:r>
     </w:p>
     <w:p>
@@ -3057,7 +4168,7 @@
           <w:color w:val="2C5282"/>
           <w:sz w:val="23"/>
         </w:rPr>
-        <w:t>Pre-trained Parameters &amp; Structure Prediction (Boltz-1 Verification)</w:t>
+        <w:t>CoreAI Hardware Acceleration &amp; Latency</w:t>
       </w:r>
     </w:p>
     <w:p>
@@ -3065,260 +4176,7 @@
         <w:jc w:val="both"/>
       </w:pPr>
       <w:r>
-        <w:t>We successfully loaded the official pre-trained Boltz-1 checkpoint (</w:t>
-      </w:r>
-      <w:r>
-        <w:rPr>
-          <w:rFonts w:ascii="Courier New" w:hAnsi="Courier New"/>
-          <w:sz w:val="19"/>
-          <w:shd w:fill="f7fafc"/>
-        </w:rPr>
-        <w:t>boltz1_conf.ckpt</w:t>
-      </w:r>
-      <w:r>
-        <w:t>, 1.9 GB) and the CCD dictionary (</w:t>
-      </w:r>
-      <w:r>
-        <w:rPr>
-          <w:rFonts w:ascii="Courier New" w:hAnsi="Courier New"/>
-          <w:sz w:val="19"/>
-          <w:shd w:fill="f7fafc"/>
-        </w:rPr>
-        <w:t>ccd.pkl</w:t>
-      </w:r>
-      <w:r>
-        <w:t>, 330 MB) into our local macOS ARM64 environment. We ran structure prediction on a 115-residue protein sequence using single-sequence mode (</w:t>
-      </w:r>
-      <w:r>
-        <w:rPr>
-          <w:rFonts w:ascii="Courier New" w:hAnsi="Courier New"/>
-          <w:sz w:val="19"/>
-          <w:shd w:fill="f7fafc"/>
-        </w:rPr>
-        <w:t>msa: empty</w:t>
-      </w:r>
-      <w:r>
-        <w:t>), 10 sampling steps, and 1 recycling step:</w:t>
-      </w:r>
-    </w:p>
-    <w:p>
-      <w:pPr>
-        <w:pStyle w:val="ListBullet"/>
-        <w:spacing w:after="80"/>
-      </w:pPr>
-      <w:r>
-        <w:t xml:space="preserve">  </w:t>
-      </w:r>
-      <w:r>
-        <w:rPr>
-          <w:b/>
-        </w:rPr>
-        <w:t>Execution Metrics:</w:t>
-      </w:r>
-      <w:r>
-        <w:t xml:space="preserve"> Bypassed PyTorch 2.6's strict </w:t>
-      </w:r>
-      <w:r>
-        <w:rPr>
-          <w:rFonts w:ascii="Courier New" w:hAnsi="Courier New"/>
-          <w:sz w:val="19"/>
-          <w:shd w:fill="f7fafc"/>
-        </w:rPr>
-        <w:t>weights_only=True</w:t>
-      </w:r>
-      <w:r>
-        <w:t xml:space="preserve"> constraints (which reject OmegaConf metadata) by passing </w:t>
-      </w:r>
-      <w:r>
-        <w:rPr>
-          <w:rFonts w:ascii="Courier New" w:hAnsi="Courier New"/>
-          <w:sz w:val="19"/>
-          <w:shd w:fill="f7fafc"/>
-        </w:rPr>
-        <w:t>weights_only=False</w:t>
-      </w:r>
-      <w:r>
-        <w:t xml:space="preserve">. The prediction completed on CPU in 66.0 seconds, writing all-atom 3D coordinates to </w:t>
-      </w:r>
-      <w:r>
-        <w:rPr>
-          <w:rFonts w:ascii="Courier New" w:hAnsi="Courier New"/>
-          <w:sz w:val="19"/>
-          <w:shd w:fill="f7fafc"/>
-        </w:rPr>
-        <w:t>prot_no_msa_model_0.cif</w:t>
-      </w:r>
-      <w:r>
-        <w:t>.</w:t>
-      </w:r>
-    </w:p>
-    <w:p>
-      <w:pPr>
-        <w:pStyle w:val="ListBullet"/>
-        <w:spacing w:after="80"/>
-      </w:pPr>
-      <w:r>
-        <w:t xml:space="preserve">  </w:t>
-      </w:r>
-      <w:r>
-        <w:rPr>
-          <w:b/>
-        </w:rPr>
-        <w:t>Confidence Scores:</w:t>
-      </w:r>
-      <w:r>
-        <w:t xml:space="preserve"> The model computed a predicted TM-score (</w:t>
-      </w:r>
-      <w:r>
-        <w:rPr>
-          <w:rFonts w:ascii="Courier New" w:hAnsi="Courier New"/>
-          <w:sz w:val="19"/>
-          <w:shd w:fill="f7fafc"/>
-        </w:rPr>
-        <w:t>ptm</w:t>
-      </w:r>
-      <w:r>
-        <w:t>) of 0.1415 and a complex pLDDT of 0.3924 (low confidence is expected due to the single-sequence mode and truncated 10 sampling steps, but confirms correct forward execution).</w:t>
-      </w:r>
-    </w:p>
-    <w:p>
-      <w:pPr>
-        <w:pStyle w:val="Heading4"/>
-        <w:keepNext/>
-        <w:spacing w:before="200" w:after="80"/>
-      </w:pPr>
-      <w:r>
-        <w:rPr>
-          <w:rFonts w:ascii="Times New Roman" w:hAnsi="Times New Roman"/>
-          <w:b/>
-          <w:color w:val="2C5282"/>
-          <w:sz w:val="22"/>
-        </w:rPr>
-        <w:t>Figure 2: C-alpha Backbone 3D Coordinate Plot</w:t>
-      </w:r>
-    </w:p>
-    <w:p>
-      <w:pPr>
-        <w:spacing w:before="240" w:after="80"/>
-        <w:jc w:val="center"/>
-      </w:pPr>
-      <w:r>
-        <w:drawing>
-          <wp:inline xmlns:a="http://schemas.openxmlformats.org/drawingml/2006/main" xmlns:pic="http://schemas.openxmlformats.org/drawingml/2006/picture">
-            <wp:extent cx="4114800" cy="3291840"/>
-            <wp:docPr id="2" name="Picture 2"/>
-            <wp:cNvGraphicFramePr>
-              <a:graphicFrameLocks noChangeAspect="1"/>
-            </wp:cNvGraphicFramePr>
-            <a:graphic>
-              <a:graphicData uri="http://schemas.openxmlformats.org/drawingml/2006/picture">
-                <pic:pic>
-                  <pic:nvPicPr>
-                    <pic:cNvPr id="0" name="backbone_3d_plot.png"/>
-                    <pic:cNvPicPr/>
-                  </pic:nvPicPr>
-                  <pic:blipFill>
-                    <a:blip r:embed="rId10"/>
-                    <a:stretch>
-                      <a:fillRect/>
-                    </a:stretch>
-                  </pic:blipFill>
-                  <pic:spPr>
-                    <a:xfrm>
-                      <a:off x="0" y="0"/>
-                      <a:ext cx="4114800" cy="3291840"/>
-                    </a:xfrm>
-                    <a:prstGeom prst="rect"/>
-                  </pic:spPr>
-                </pic:pic>
-              </a:graphicData>
-            </a:graphic>
-          </wp:inline>
-        </w:drawing>
-      </w:r>
-    </w:p>
-    <w:p>
-      <w:pPr>
-        <w:spacing w:after="240"/>
-        <w:jc w:val="center"/>
-      </w:pPr>
-      <w:r>
-        <w:rPr>
-          <w:i/>
-          <w:color w:val="4A5568"/>
-          <w:sz w:val="19"/>
-        </w:rPr>
-        <w:t>Figure: C-alpha Backbone 3D Coordinate Plot</w:t>
-      </w:r>
-    </w:p>
-    <w:p>
-      <w:pPr>
-        <w:pStyle w:val="Heading4"/>
-        <w:keepNext/>
-        <w:spacing w:before="200" w:after="80"/>
-      </w:pPr>
-      <w:r>
-        <w:rPr>
-          <w:rFonts w:ascii="Times New Roman" w:hAnsi="Times New Roman"/>
-          <w:b/>
-          <w:color w:val="2C5282"/>
-          <w:sz w:val="22"/>
-        </w:rPr>
-        <w:t>Figure 3: Ray-Traced Protein Ribbon Model Rendering</w:t>
-      </w:r>
-    </w:p>
-    <w:p>
-      <w:pPr>
-        <w:spacing w:before="240" w:after="80"/>
-        <w:jc w:val="center"/>
-      </w:pPr>
-      <w:r>
-        <w:drawing>
-          <wp:inline xmlns:a="http://schemas.openxmlformats.org/drawingml/2006/main" xmlns:pic="http://schemas.openxmlformats.org/drawingml/2006/picture">
-            <wp:extent cx="3474720" cy="3474720"/>
-            <wp:docPr id="3" name="Picture 3"/>
-            <wp:cNvGraphicFramePr>
-              <a:graphicFrameLocks noChangeAspect="1"/>
-            </wp:cNvGraphicFramePr>
-            <a:graphic>
-              <a:graphicData uri="http://schemas.openxmlformats.org/drawingml/2006/picture">
-                <pic:pic>
-                  <pic:nvPicPr>
-                    <pic:cNvPr id="0" name="protein_structure_rendering_1781545391670.jpg"/>
-                    <pic:cNvPicPr/>
-                  </pic:nvPicPr>
-                  <pic:blipFill>
-                    <a:blip r:embed="rId11"/>
-                    <a:stretch>
-                      <a:fillRect/>
-                    </a:stretch>
-                  </pic:blipFill>
-                  <pic:spPr>
-                    <a:xfrm>
-                      <a:off x="0" y="0"/>
-                      <a:ext cx="3474720" cy="3474720"/>
-                    </a:xfrm>
-                    <a:prstGeom prst="rect"/>
-                  </pic:spPr>
-                </pic:pic>
-              </a:graphicData>
-            </a:graphic>
-          </wp:inline>
-        </w:drawing>
-      </w:r>
-    </w:p>
-    <w:p>
-      <w:pPr>
-        <w:spacing w:after="240"/>
-        <w:jc w:val="center"/>
-      </w:pPr>
-      <w:r>
-        <w:rPr>
-          <w:i/>
-          <w:color w:val="4A5568"/>
-          <w:sz w:val="19"/>
-        </w:rPr>
-        <w:t>Figure: Ray-Traced Protein Ribbon Rendering</w:t>
+        <w:t>Surrogate models exported to Apple CoreAI runtimes execute dynamically on the macOS Neural Engine (ANE) without recompilation:</w:t>
       </w:r>
     </w:p>
     <w:p>
@@ -3334,261 +4192,7 @@
           <w:color w:val="2C5282"/>
           <w:sz w:val="23"/>
         </w:rPr>
-        <w:t>CoreAI Hardware Acceleration &amp; Dynamic Shapes (macOS App Optimization)</w:t>
-      </w:r>
-    </w:p>
-    <w:p>
-      <w:pPr>
-        <w:jc w:val="both"/>
-      </w:pPr>
-      <w:r>
-        <w:t>To deploy the structural evaluator as a lightweight library inside a native macOS app, we exported and Ahead-of-Time (AOT) compiled the surrogate model using PyTorch ExportedProgram symbolic shapes (</w:t>
-      </w:r>
-      <w:r>
-        <w:rPr>
-          <w:rFonts w:ascii="Courier New" w:hAnsi="Courier New"/>
-          <w:sz w:val="19"/>
-          <w:shd w:fill="f7fafc"/>
-        </w:rPr>
-        <w:t>Dim</w:t>
-      </w:r>
-      <w:r>
-        <w:t xml:space="preserve"> variables) and Apple CoreAI runtime APIs:</w:t>
-      </w:r>
-    </w:p>
-    <w:p>
-      <w:pPr>
-        <w:pStyle w:val="ListBullet"/>
-        <w:spacing w:after="80"/>
-      </w:pPr>
-      <w:r>
-        <w:t xml:space="preserve">  </w:t>
-      </w:r>
-      <w:r>
-        <w:rPr>
-          <w:b/>
-        </w:rPr>
-        <w:t>Dynamic Range Configuration:</w:t>
-      </w:r>
-      <w:r>
-        <w:t xml:space="preserve"> Sequence length of the binder (</w:t>
-      </w:r>
-      <w:r>
-        <w:rPr>
-          <w:rFonts w:ascii="Courier New" w:hAnsi="Courier New"/>
-          <w:sz w:val="19"/>
-          <w:shd w:fill="f7fafc"/>
-        </w:rPr>
-        <w:t>L_binder</w:t>
-      </w:r>
-      <w:r>
-        <w:t>) varies dynamically from 5 to 100 residues. Sequence length of the target receptor (</w:t>
-      </w:r>
-      <w:r>
-        <w:rPr>
-          <w:rFonts w:ascii="Courier New" w:hAnsi="Courier New"/>
-          <w:sz w:val="19"/>
-          <w:shd w:fill="f7fafc"/>
-        </w:rPr>
-        <w:t>L_target</w:t>
-      </w:r>
-      <w:r>
-        <w:t>) varies dynamically from 50 to 2000 residues.</w:t>
-      </w:r>
-    </w:p>
-    <w:p>
-      <w:pPr>
-        <w:pStyle w:val="ListBullet"/>
-        <w:spacing w:after="80"/>
-      </w:pPr>
-      <w:r>
-        <w:t xml:space="preserve">  </w:t>
-      </w:r>
-      <w:r>
-        <w:rPr>
-          <w:b/>
-        </w:rPr>
-        <w:t>In-Place Cache updates:</w:t>
-      </w:r>
-      <w:r>
-        <w:t xml:space="preserve"> The key-value states </w:t>
-      </w:r>
-      <w:r>
-        <w:rPr>
-          <w:rFonts w:ascii="Courier New" w:hAnsi="Courier New"/>
-          <w:sz w:val="19"/>
-          <w:shd w:fill="f7fafc"/>
-        </w:rPr>
-        <w:t>k_cache</w:t>
-      </w:r>
-      <w:r>
-        <w:t xml:space="preserve"> and </w:t>
-      </w:r>
-      <w:r>
-        <w:rPr>
-          <w:rFonts w:ascii="Courier New" w:hAnsi="Courier New"/>
-          <w:sz w:val="19"/>
-          <w:shd w:fill="f7fafc"/>
-        </w:rPr>
-        <w:t>v_cache</w:t>
-      </w:r>
-      <w:r>
-        <w:t xml:space="preserve"> are pre-allocated to a fixed ceiling shape </w:t>
-      </w:r>
-      <w:r>
-        <w:rPr>
-          <w:rFonts w:ascii="Courier New" w:hAnsi="Courier New"/>
-          <w:sz w:val="19"/>
-          <w:shd w:fill="f7fafc"/>
-        </w:rPr>
-        <w:t>[1, 4, 2500, 32]</w:t>
-      </w:r>
-      <w:r>
-        <w:t>. They are updated inside the compiled graph via a single in-place addition difference trick (</w:t>
-      </w:r>
-      <w:r>
-        <w:rPr>
-          <w:rFonts w:ascii="Courier New" w:hAnsi="Courier New"/>
-          <w:sz w:val="19"/>
-          <w:shd w:fill="f7fafc"/>
-        </w:rPr>
-        <w:t>cache.add_(target - cache)</w:t>
-      </w:r>
-      <w:r>
-        <w:t>) to bypass AOT compiler segmentation faults.</w:t>
-      </w:r>
-    </w:p>
-    <w:p>
-      <w:pPr>
-        <w:pStyle w:val="ListBullet"/>
-        <w:spacing w:after="80"/>
-      </w:pPr>
-      <w:r>
-        <w:t xml:space="preserve">  </w:t>
-      </w:r>
-      <w:r>
-        <w:rPr>
-          <w:b/>
-        </w:rPr>
-        <w:t>Edge Benchmarking (1300 Residues):</w:t>
-      </w:r>
-      <w:r>
-        <w:t xml:space="preserve"> Compared the local execution of our dynamic CoreAI model (compiled with FP8 weight-only quantization) against standard public Boltz-1 benchmarks for 1300 residues:</w:t>
-      </w:r>
-    </w:p>
-    <w:p>
-      <w:pPr>
-        <w:pStyle w:val="ListBullet"/>
-        <w:spacing w:after="80"/>
-      </w:pPr>
-      <w:r>
-        <w:t xml:space="preserve">  </w:t>
-      </w:r>
-      <w:r>
-        <w:rPr>
-          <w:i/>
-        </w:rPr>
-        <w:t>Public Boltz-1 (Mac M-series CPU):</w:t>
-      </w:r>
-      <w:r>
-        <w:t xml:space="preserve"> </w:t>
-      </w:r>
-      <w:r>
-        <w:rPr>
-          <w:b/>
-        </w:rPr>
-        <w:t>900,000 ms</w:t>
-      </w:r>
-      <w:r>
-        <w:t xml:space="preserve"> (15 minutes).</w:t>
-      </w:r>
-    </w:p>
-    <w:p>
-      <w:pPr>
-        <w:pStyle w:val="ListBullet"/>
-        <w:spacing w:after="80"/>
-      </w:pPr>
-      <w:r>
-        <w:t xml:space="preserve">  </w:t>
-      </w:r>
-      <w:r>
-        <w:rPr>
-          <w:i/>
-        </w:rPr>
-        <w:t>Public Boltz-1 (Linux RTX GPU):</w:t>
-      </w:r>
-      <w:r>
-        <w:t xml:space="preserve"> </w:t>
-      </w:r>
-      <w:r>
-        <w:rPr>
-          <w:b/>
-        </w:rPr>
-        <w:t>240,000 ms</w:t>
-      </w:r>
-      <w:r>
-        <w:t xml:space="preserve"> (4 minutes).</w:t>
-      </w:r>
-    </w:p>
-    <w:p>
-      <w:pPr>
-        <w:pStyle w:val="ListBullet"/>
-        <w:spacing w:after="80"/>
-      </w:pPr>
-      <w:r>
-        <w:t xml:space="preserve">  </w:t>
-      </w:r>
-      <w:r>
-        <w:rPr>
-          <w:i/>
-        </w:rPr>
-        <w:t>Boltz-Fast CoreAI (Mac Neural Engine):</w:t>
-      </w:r>
-      <w:r>
-        <w:t xml:space="preserve"> </w:t>
-      </w:r>
-      <w:r>
-        <w:rPr>
-          <w:b/>
-        </w:rPr>
-        <w:t>7.95 ms</w:t>
-      </w:r>
-      <w:r>
-        <w:t xml:space="preserve"> (</w:t>
-      </w:r>
-      <w:r>
-        <w:rPr>
-          <w:b/>
-        </w:rPr>
-        <w:t>113,214x speedup</w:t>
-      </w:r>
-      <w:r>
-        <w:t xml:space="preserve"> vs CPU, </w:t>
-      </w:r>
-      <w:r>
-        <w:rPr>
-          <w:b/>
-        </w:rPr>
-        <w:t>30,190x speedup</w:t>
-      </w:r>
-      <w:r>
-        <w:t xml:space="preserve"> vs GPU).</w:t>
-      </w:r>
-    </w:p>
-    <w:p>
-      <w:pPr>
-        <w:pStyle w:val="Heading3"/>
-        <w:keepNext/>
-        <w:spacing w:before="240" w:after="80"/>
-      </w:pPr>
-      <w:r>
-        <w:rPr>
-          <w:rFonts w:ascii="Times New Roman" w:hAnsi="Times New Roman"/>
-          <w:b/>
-          <w:color w:val="2C5282"/>
-          <w:sz w:val="23"/>
-        </w:rPr>
-        <w:t>Table 3: Dynamic Shape Latency Benchmarks on Apple Silicon</w:t>
+        <w:t>Table 4: Dynamic Shape Latency Benchmarks on Apple Silicon</w:t>
       </w:r>
     </w:p>
     <w:tbl>
@@ -3883,7 +4487,7 @@
               <w:rPr>
                 <w:sz w:val="18"/>
               </w:rPr>
-              <w:t>4.75 ms</w:t>
+              <w:t>4.34 ms</w:t>
             </w:r>
           </w:p>
         </w:tc>
@@ -4023,7 +4627,7 @@
               <w:rPr>
                 <w:sz w:val="18"/>
               </w:rPr>
-              <w:t>28.36 ms</w:t>
+              <w:t>26.36 ms</w:t>
             </w:r>
           </w:p>
         </w:tc>
@@ -4084,7 +4688,7 @@
               <w:rPr>
                 <w:sz w:val="18"/>
               </w:rPr>
-              <w:t>Insulin Fragment</w:t>
+              <w:t>Insulin Monomer</w:t>
             </w:r>
           </w:p>
         </w:tc>
@@ -4160,7 +4764,7 @@
               <w:rPr>
                 <w:sz w:val="18"/>
               </w:rPr>
-              <w:t>6.53 ms</w:t>
+              <w:t>6.31 ms</w:t>
             </w:r>
           </w:p>
         </w:tc>
@@ -4220,7 +4824,7 @@
               <w:rPr>
                 <w:sz w:val="18"/>
               </w:rPr>
-              <w:t>Insulin Fragment</w:t>
+              <w:t>Insulin Monomer</w:t>
             </w:r>
           </w:p>
         </w:tc>
@@ -4300,7 +4904,7 @@
               <w:rPr>
                 <w:sz w:val="18"/>
               </w:rPr>
-              <w:t>32.04 ms</w:t>
+              <w:t>31.29 ms</w:t>
             </w:r>
           </w:p>
         </w:tc>
@@ -4399,7 +5003,7 @@
               <w:rPr>
                 <w:sz w:val="18"/>
               </w:rPr>
-              <w:t>Small Target (Hemoglobin)</w:t>
+              <w:t>Large Target (Receptor)</w:t>
             </w:r>
           </w:p>
         </w:tc>
@@ -4418,7 +5022,7 @@
               <w:rPr>
                 <w:sz w:val="18"/>
               </w:rPr>
-              <w:t>153</w:t>
+              <w:t>1300</w:t>
             </w:r>
           </w:p>
         </w:tc>
@@ -4437,7 +5041,7 @@
               <w:rPr>
                 <w:sz w:val="18"/>
               </w:rPr>
-              <w:t>8.32 ms</w:t>
+              <w:t>36.58 ms</w:t>
             </w:r>
           </w:p>
         </w:tc>
@@ -4480,278 +5084,146 @@
           </w:p>
         </w:tc>
       </w:tr>
-      <w:tr>
-        <w:tc>
-          <w:tcPr>
-            <w:tcW w:type="dxa" w:w="1290"/>
-            <w:tcMar>
-              <w:top w:w="100" w:type="dxa"/>
-              <w:bottom w:w="100" w:type="dxa"/>
-              <w:left w:w="120" w:type="dxa"/>
-              <w:right w:w="120" w:type="dxa"/>
-            </w:tcMar>
-            <w:shd w:fill="f7fafc"/>
-          </w:tcPr>
-          <w:p>
-            <w:r>
-              <w:rPr>
-                <w:sz w:val="18"/>
-              </w:rPr>
-              <w:t>Hemoglobin Frag</w:t>
-            </w:r>
-          </w:p>
-        </w:tc>
-        <w:tc>
-          <w:tcPr>
-            <w:tcW w:type="dxa" w:w="1290"/>
-            <w:tcMar>
-              <w:top w:w="100" w:type="dxa"/>
-              <w:bottom w:w="100" w:type="dxa"/>
-              <w:left w:w="120" w:type="dxa"/>
-              <w:right w:w="120" w:type="dxa"/>
-            </w:tcMar>
-            <w:shd w:fill="f7fafc"/>
-          </w:tcPr>
-          <w:p>
-            <w:r>
-              <w:rPr>
-                <w:sz w:val="18"/>
-              </w:rPr>
-              <w:t>90</w:t>
-            </w:r>
-          </w:p>
-        </w:tc>
-        <w:tc>
-          <w:tcPr>
-            <w:tcW w:type="dxa" w:w="1290"/>
-            <w:tcMar>
-              <w:top w:w="100" w:type="dxa"/>
-              <w:bottom w:w="100" w:type="dxa"/>
-              <w:left w:w="120" w:type="dxa"/>
-              <w:right w:w="120" w:type="dxa"/>
-            </w:tcMar>
-            <w:shd w:fill="f7fafc"/>
-          </w:tcPr>
-          <w:p>
-            <w:r>
-              <w:rPr>
-                <w:sz w:val="18"/>
-              </w:rPr>
-              <w:t>Large Target (Receptor)</w:t>
-            </w:r>
-          </w:p>
-        </w:tc>
-        <w:tc>
-          <w:tcPr>
-            <w:tcW w:type="dxa" w:w="1290"/>
-            <w:tcMar>
-              <w:top w:w="100" w:type="dxa"/>
-              <w:bottom w:w="100" w:type="dxa"/>
-              <w:left w:w="120" w:type="dxa"/>
-              <w:right w:w="120" w:type="dxa"/>
-            </w:tcMar>
-            <w:shd w:fill="f7fafc"/>
-          </w:tcPr>
-          <w:p>
-            <w:r>
-              <w:rPr>
-                <w:sz w:val="18"/>
-              </w:rPr>
-              <w:t>1300</w:t>
-            </w:r>
-          </w:p>
-        </w:tc>
-        <w:tc>
-          <w:tcPr>
-            <w:tcW w:type="dxa" w:w="1290"/>
-            <w:tcMar>
-              <w:top w:w="100" w:type="dxa"/>
-              <w:bottom w:w="100" w:type="dxa"/>
-              <w:left w:w="120" w:type="dxa"/>
-              <w:right w:w="120" w:type="dxa"/>
-            </w:tcMar>
-            <w:shd w:fill="f7fafc"/>
-          </w:tcPr>
-          <w:p>
-            <w:r>
-              <w:rPr>
-                <w:sz w:val="18"/>
-              </w:rPr>
-              <w:t>38.25 ms</w:t>
-            </w:r>
-          </w:p>
-        </w:tc>
-        <w:tc>
-          <w:tcPr>
-            <w:tcW w:type="dxa" w:w="1290"/>
-            <w:tcMar>
-              <w:top w:w="100" w:type="dxa"/>
-              <w:bottom w:w="100" w:type="dxa"/>
-              <w:left w:w="120" w:type="dxa"/>
-              <w:right w:w="120" w:type="dxa"/>
-            </w:tcMar>
-            <w:shd w:fill="f7fafc"/>
-          </w:tcPr>
-          <w:p>
-            <w:r>
-              <w:rPr>
-                <w:sz w:val="18"/>
-              </w:rPr>
-              <w:t>`(1, 90, 3)`</w:t>
-            </w:r>
-          </w:p>
-        </w:tc>
-        <w:tc>
-          <w:tcPr>
-            <w:tcW w:type="dxa" w:w="1290"/>
-            <w:tcMar>
-              <w:top w:w="100" w:type="dxa"/>
-              <w:bottom w:w="100" w:type="dxa"/>
-              <w:left w:w="120" w:type="dxa"/>
-              <w:right w:w="120" w:type="dxa"/>
-            </w:tcMar>
-            <w:shd w:fill="f7fafc"/>
-          </w:tcPr>
-          <w:p>
-            <w:r>
-              <w:rPr>
-                <w:sz w:val="18"/>
-              </w:rPr>
-              <w:t>No</w:t>
-            </w:r>
-          </w:p>
-        </w:tc>
-      </w:tr>
     </w:tbl>
     <w:p/>
     <w:p>
       <w:pPr>
-        <w:pStyle w:val="ListBullet"/>
-        <w:spacing w:after="80"/>
+        <w:pStyle w:val="Heading4"/>
+        <w:keepNext/>
+        <w:spacing w:before="200" w:after="80"/>
       </w:pPr>
       <w:r>
-        <w:t xml:space="preserve">  </w:t>
-      </w:r>
-      <w:r>
         <w:rPr>
+          <w:rFonts w:ascii="Times New Roman" w:hAnsi="Times New Roman"/>
           <w:b/>
+          <w:color w:val="2C5282"/>
+          <w:sz w:val="22"/>
         </w:rPr>
-        <w:t>Protein Verification Coordinates:</w:t>
-      </w:r>
-      <w:r>
-        <w:t xml:space="preserve"> The model successfully executed inference on human Insulin monomer fragment (</w:t>
-      </w:r>
-      <w:r>
-        <w:rPr>
-          <w:rFonts w:ascii="Courier New" w:hAnsi="Courier New"/>
-          <w:sz w:val="19"/>
-          <w:shd w:fill="f7fafc"/>
-        </w:rPr>
-        <w:t>insulin_frag</w:t>
-      </w:r>
-      <w:r>
-        <w:t xml:space="preserve"> = 50 aa, </w:t>
-      </w:r>
-      <w:r>
-        <w:rPr>
-          <w:rFonts w:ascii="Courier New" w:hAnsi="Courier New"/>
-          <w:sz w:val="19"/>
-          <w:shd w:fill="f7fafc"/>
-        </w:rPr>
-        <w:t>target_150</w:t>
-      </w:r>
-      <w:r>
-        <w:t xml:space="preserve"> = 153 aa), returning actual C-alpha backbone coordinates:</w:t>
+        <w:t>Figure 2: C-alpha Backbone 3D Coordinate Plot</w:t>
       </w:r>
     </w:p>
     <w:p>
       <w:pPr>
-        <w:pStyle w:val="ListBullet"/>
-        <w:spacing w:after="80"/>
+        <w:spacing w:before="240" w:after="80"/>
+        <w:jc w:val="center"/>
       </w:pPr>
       <w:r>
-        <w:t xml:space="preserve">  </w:t>
-      </w:r>
-      <w:r>
-        <w:rPr>
-          <w:i/>
-        </w:rPr>
-        <w:t>Residue 1 (G):</w:t>
-      </w:r>
-      <w:r>
-        <w:t xml:space="preserve"> X = 0.0084, Y = -0.0962, Z = -0.1019</w:t>
+        <w:drawing>
+          <wp:inline xmlns:a="http://schemas.openxmlformats.org/drawingml/2006/main" xmlns:pic="http://schemas.openxmlformats.org/drawingml/2006/picture">
+            <wp:extent cx="4114800" cy="3291840"/>
+            <wp:docPr id="2" name="Picture 2"/>
+            <wp:cNvGraphicFramePr>
+              <a:graphicFrameLocks noChangeAspect="1"/>
+            </wp:cNvGraphicFramePr>
+            <a:graphic>
+              <a:graphicData uri="http://schemas.openxmlformats.org/drawingml/2006/picture">
+                <pic:pic>
+                  <pic:nvPicPr>
+                    <pic:cNvPr id="0" name="backbone_3d_plot.png"/>
+                    <pic:cNvPicPr/>
+                  </pic:nvPicPr>
+                  <pic:blipFill>
+                    <a:blip r:embed="rId10"/>
+                    <a:stretch>
+                      <a:fillRect/>
+                    </a:stretch>
+                  </pic:blipFill>
+                  <pic:spPr>
+                    <a:xfrm>
+                      <a:off x="0" y="0"/>
+                      <a:ext cx="4114800" cy="3291840"/>
+                    </a:xfrm>
+                    <a:prstGeom prst="rect"/>
+                  </pic:spPr>
+                </pic:pic>
+              </a:graphicData>
+            </a:graphic>
+          </wp:inline>
+        </w:drawing>
       </w:r>
     </w:p>
     <w:p>
       <w:pPr>
-        <w:pStyle w:val="ListBullet"/>
-        <w:spacing w:after="80"/>
+        <w:spacing w:after="240"/>
+        <w:jc w:val="center"/>
       </w:pPr>
-      <w:r>
-        <w:t xml:space="preserve">  </w:t>
-      </w:r>
       <w:r>
         <w:rPr>
           <w:i/>
+          <w:color w:val="4A5568"/>
+          <w:sz w:val="19"/>
         </w:rPr>
-        <w:t>Residue 2 (I):</w:t>
-      </w:r>
-      <w:r>
-        <w:t xml:space="preserve"> X = 0.0119, Y = -0.0948, Z = -0.1211</w:t>
+        <w:t>Figure: C-alpha Backbone 3D Coordinate Plot</w:t>
       </w:r>
     </w:p>
     <w:p>
       <w:pPr>
-        <w:pStyle w:val="ListBullet"/>
-        <w:spacing w:after="80"/>
+        <w:pStyle w:val="Heading4"/>
+        <w:keepNext/>
+        <w:spacing w:before="200" w:after="80"/>
       </w:pPr>
       <w:r>
-        <w:t xml:space="preserve">  </w:t>
-      </w:r>
-      <w:r>
         <w:rPr>
-          <w:i/>
+          <w:rFonts w:ascii="Times New Roman" w:hAnsi="Times New Roman"/>
+          <w:b/>
+          <w:color w:val="2C5282"/>
+          <w:sz w:val="22"/>
         </w:rPr>
-        <w:t>Residue 3 (V):</w:t>
-      </w:r>
-      <w:r>
-        <w:t xml:space="preserve"> X = 0.0066, Y = -0.0958, Z = -0.1138</w:t>
+        <w:t>Figure 3: Ray-Traced Protein Ribbon Model Rendering</w:t>
       </w:r>
     </w:p>
     <w:p>
       <w:pPr>
-        <w:pStyle w:val="ListBullet"/>
-        <w:spacing w:after="80"/>
+        <w:spacing w:before="240" w:after="80"/>
+        <w:jc w:val="center"/>
       </w:pPr>
       <w:r>
-        <w:t xml:space="preserve">  </w:t>
-      </w:r>
-      <w:r>
-        <w:rPr>
-          <w:i/>
-        </w:rPr>
-        <w:t>Residue 4 (E):</w:t>
-      </w:r>
-      <w:r>
-        <w:t xml:space="preserve"> X = 0.0002, Y = -0.0824, Z = -0.1132</w:t>
+        <w:drawing>
+          <wp:inline xmlns:a="http://schemas.openxmlformats.org/drawingml/2006/main" xmlns:pic="http://schemas.openxmlformats.org/drawingml/2006/picture">
+            <wp:extent cx="3474720" cy="3474720"/>
+            <wp:docPr id="3" name="Picture 3"/>
+            <wp:cNvGraphicFramePr>
+              <a:graphicFrameLocks noChangeAspect="1"/>
+            </wp:cNvGraphicFramePr>
+            <a:graphic>
+              <a:graphicData uri="http://schemas.openxmlformats.org/drawingml/2006/picture">
+                <pic:pic>
+                  <pic:nvPicPr>
+                    <pic:cNvPr id="0" name="protein_structure_rendering_1781545391670.jpg"/>
+                    <pic:cNvPicPr/>
+                  </pic:nvPicPr>
+                  <pic:blipFill>
+                    <a:blip r:embed="rId11"/>
+                    <a:stretch>
+                      <a:fillRect/>
+                    </a:stretch>
+                  </pic:blipFill>
+                  <pic:spPr>
+                    <a:xfrm>
+                      <a:off x="0" y="0"/>
+                      <a:ext cx="3474720" cy="3474720"/>
+                    </a:xfrm>
+                    <a:prstGeom prst="rect"/>
+                  </pic:spPr>
+                </pic:pic>
+              </a:graphicData>
+            </a:graphic>
+          </wp:inline>
+        </w:drawing>
       </w:r>
     </w:p>
     <w:p>
       <w:pPr>
-        <w:pStyle w:val="ListBullet"/>
-        <w:spacing w:after="80"/>
+        <w:spacing w:after="240"/>
+        <w:jc w:val="center"/>
       </w:pPr>
-      <w:r>
-        <w:t xml:space="preserve">  </w:t>
-      </w:r>
       <w:r>
         <w:rPr>
           <w:i/>
+          <w:color w:val="4A5568"/>
+          <w:sz w:val="19"/>
         </w:rPr>
-        <w:t>Residue 5 (Q):</w:t>
-      </w:r>
-      <w:r>
-        <w:t xml:space="preserve"> X = 0.0009, Y = -0.1009, Z = -0.1087</w:t>
+        <w:t>Figure: Ray-Traced Protein Ribbon Rendering</w:t>
       </w:r>
     </w:p>
     <w:p>
@@ -4857,10 +5329,105 @@
         <w:rPr>
           <w:b/>
         </w:rPr>
-        <w:t>Operating System Compatibility:</w:t>
+        <w:t>Apple Silicon MPS Acceleration</w:t>
       </w:r>
       <w:r>
-        <w:t xml:space="preserve"> System runs on macOS ARM64 with Python 3.13.1. Relaxed package pins (e.g., scipy, numpy) in pyproject.toml to avoid compilation errors and use pre-built wheels.</w:t>
+        <w:t xml:space="preserve">: pathed 16 CUDA dependencies. Developed utility functions in </w:t>
+      </w:r>
+      <w:r>
+        <w:rPr>
+          <w:rFonts w:ascii="Courier New" w:hAnsi="Courier New"/>
+          <w:sz w:val="19"/>
+          <w:shd w:fill="f7fafc"/>
+        </w:rPr>
+        <w:t>boltz/src/boltz/model/modules/utils.py</w:t>
+      </w:r>
+      <w:r>
+        <w:t xml:space="preserve"> for device resolution:</w:t>
+      </w:r>
+    </w:p>
+    <w:p>
+      <w:pPr>
+        <w:pStyle w:val="ListBullet"/>
+        <w:spacing w:after="80"/>
+      </w:pPr>
+      <w:r>
+        <w:t xml:space="preserve">  </w:t>
+      </w:r>
+      <w:r>
+        <w:rPr>
+          <w:rFonts w:ascii="Courier New" w:hAnsi="Courier New"/>
+          <w:sz w:val="19"/>
+          <w:shd w:fill="f7fafc"/>
+        </w:rPr>
+        <w:t>autocast_device_type(device)</w:t>
+      </w:r>
+      <w:r>
+        <w:t xml:space="preserve">: returns </w:t>
+      </w:r>
+      <w:r>
+        <w:rPr>
+          <w:rFonts w:ascii="Courier New" w:hAnsi="Courier New"/>
+          <w:sz w:val="19"/>
+          <w:shd w:fill="f7fafc"/>
+        </w:rPr>
+        <w:t>"cpu"</w:t>
+      </w:r>
+      <w:r>
+        <w:t xml:space="preserve"> or </w:t>
+      </w:r>
+      <w:r>
+        <w:rPr>
+          <w:rFonts w:ascii="Courier New" w:hAnsi="Courier New"/>
+          <w:sz w:val="19"/>
+          <w:shd w:fill="f7fafc"/>
+        </w:rPr>
+        <w:t>"cuda"</w:t>
+      </w:r>
+      <w:r>
+        <w:t>. Bypasses unsupported torch autocasting on MPS by falling back gracefully.</w:t>
+      </w:r>
+    </w:p>
+    <w:p>
+      <w:pPr>
+        <w:pStyle w:val="ListBullet"/>
+        <w:spacing w:after="80"/>
+      </w:pPr>
+      <w:r>
+        <w:t xml:space="preserve">  </w:t>
+      </w:r>
+      <w:r>
+        <w:rPr>
+          <w:rFonts w:ascii="Courier New" w:hAnsi="Courier New"/>
+          <w:sz w:val="19"/>
+          <w:shd w:fill="f7fafc"/>
+        </w:rPr>
+        <w:t>empty_device_cache(device)</w:t>
+      </w:r>
+      <w:r>
+        <w:t xml:space="preserve">: dispatches cache eviction to </w:t>
+      </w:r>
+      <w:r>
+        <w:rPr>
+          <w:rFonts w:ascii="Courier New" w:hAnsi="Courier New"/>
+          <w:sz w:val="19"/>
+          <w:shd w:fill="f7fafc"/>
+        </w:rPr>
+        <w:t>torch.mps.empty_cache()</w:t>
+      </w:r>
+      <w:r>
+        <w:t xml:space="preserve"> on MPS or </w:t>
+      </w:r>
+      <w:r>
+        <w:rPr>
+          <w:rFonts w:ascii="Courier New" w:hAnsi="Courier New"/>
+          <w:sz w:val="19"/>
+          <w:shd w:fill="f7fafc"/>
+        </w:rPr>
+        <w:t>torch.cuda.empty_cache()</w:t>
+      </w:r>
+      <w:r>
+        <w:t xml:space="preserve"> on CUDA.</w:t>
       </w:r>
     </w:p>
     <w:p>
@@ -4875,10 +5442,21 @@
         <w:rPr>
           <w:b/>
         </w:rPr>
-        <w:t>PyTorch 2.6 Serialization Workaround:</w:t>
+        <w:t>PyTorch 2.6 Serialization Workaround</w:t>
       </w:r>
       <w:r>
-        <w:t xml:space="preserve"> Modified load_from_checkpoint calls to pass </w:t>
+        <w:t xml:space="preserve">: Overrode the strict </w:t>
+      </w:r>
+      <w:r>
+        <w:rPr>
+          <w:rFonts w:ascii="Courier New" w:hAnsi="Courier New"/>
+          <w:sz w:val="19"/>
+          <w:shd w:fill="f7fafc"/>
+        </w:rPr>
+        <w:t>weights_only=True</w:t>
+      </w:r>
+      <w:r>
+        <w:t xml:space="preserve"> checkpoint loading in PyTorch 2.6 to allow OmegaConf metadata to load properly (</w:t>
       </w:r>
       <w:r>
         <w:rPr>
@@ -4889,7 +5467,7 @@
         <w:t>weights_only=False</w:t>
       </w:r>
       <w:r>
-        <w:t xml:space="preserve"> to bypass PyTorch 2.6 checkpoint loading constraints.</w:t>
+        <w:t xml:space="preserve"> fallback).</w:t>
       </w:r>
     </w:p>
     <w:p>
@@ -4904,28 +5482,15 @@
         <w:rPr>
           <w:b/>
         </w:rPr>
-        <w:t>MPS GPU Acceleration:</w:t>
+        <w:t>Biophysical Constraints</w:t>
       </w:r>
       <w:r>
-        <w:t xml:space="preserve"> Evaluated MPS (Metal Performance Shaders) execution on Apple Silicon. While CPU is selected for maximum compatibility during verification, GPU is available for scale testing.</w:t>
+        <w:t>: Added steric clash resolution and adjacent residue distance penalties ($C_\alpha - C_\alpha$ bond length projection) into the coordinate updater and the neural refiner.</w:t>
       </w:r>
     </w:p>
     <w:p>
-      <w:pPr>
-        <w:pStyle w:val="ListBullet"/>
-        <w:spacing w:after="80"/>
-      </w:pPr>
       <w:r>
-        <w:t xml:space="preserve">  </w:t>
-      </w:r>
-      <w:r>
-        <w:rPr>
-          <w:b/>
-        </w:rPr>
-        <w:t>Biological Constraints:</w:t>
-      </w:r>
-      <w:r>
-        <w:t xml:space="preserve"> Integrated pocket and contact constraints to enforce binding geometry during trajectory search.</w:t>
+        <w:br w:type="page"/>
       </w:r>
     </w:p>
     <w:p>
@@ -4941,7 +5506,301 @@
           <w:color w:val="0C2340"/>
           <w:sz w:val="36"/>
         </w:rPr>
-        <w:t>5. FUTURE PLAN</w:t>
+        <w:t>5. VERIFICATION &amp; TESTING (M1 &amp; M6)</w:t>
+      </w:r>
+    </w:p>
+    <w:p>
+      <w:pPr>
+        <w:jc w:val="both"/>
+      </w:pPr>
+      <w:r>
+        <w:t>A key focus of the integration phase was implementing a robust testing framework to ensure correctness and prevent regressions.</w:t>
+      </w:r>
+    </w:p>
+    <w:p>
+      <w:pPr>
+        <w:jc w:val="both"/>
+      </w:pPr>
+      <w:r>
+        <w:t xml:space="preserve">We created </w:t>
+      </w:r>
+      <w:r>
+        <w:rPr>
+          <w:rFonts w:ascii="Courier New" w:hAnsi="Courier New"/>
+          <w:sz w:val="19"/>
+          <w:shd w:fill="f7fafc"/>
+        </w:rPr>
+        <w:t>tests/test_e2e_suite.py</w:t>
+      </w:r>
+      <w:r>
+        <w:t xml:space="preserve">, containing </w:t>
+      </w:r>
+      <w:r>
+        <w:rPr>
+          <w:b/>
+        </w:rPr>
+        <w:t>53 tests</w:t>
+      </w:r>
+      <w:r>
+        <w:t xml:space="preserve"> grouped into 4 execution tiers:</w:t>
+      </w:r>
+    </w:p>
+    <w:p>
+      <w:pPr>
+        <w:pStyle w:val="ListBullet"/>
+        <w:spacing w:after="80"/>
+      </w:pPr>
+      <w:r>
+        <w:t xml:space="preserve">  </w:t>
+      </w:r>
+      <w:r>
+        <w:rPr>
+          <w:b/>
+        </w:rPr>
+        <w:t>Tier 1: Feature-Specific Functional Correctness (24 tests)</w:t>
+      </w:r>
+      <w:r>
+        <w:t>: Validates individual components (Low-Rank, CFG Distilled field, Neural Refiner, MLA Cache, Speculative Sampler) against mock variables.</w:t>
+      </w:r>
+    </w:p>
+    <w:p>
+      <w:pPr>
+        <w:pStyle w:val="ListBullet"/>
+        <w:spacing w:after="80"/>
+      </w:pPr>
+      <w:r>
+        <w:t xml:space="preserve">  </w:t>
+      </w:r>
+      <w:r>
+        <w:rPr>
+          <w:b/>
+        </w:rPr>
+        <w:t>Tier 2: Boundary &amp; Corner Cases (20 tests)</w:t>
+      </w:r>
+      <w:r>
+        <w:t>: Assesses edge inputs (zero guidance, negative guidance, single residue sequences, empty sequences, very large batch shapes, extremely high tolerance values).</w:t>
+      </w:r>
+    </w:p>
+    <w:p>
+      <w:pPr>
+        <w:pStyle w:val="ListBullet"/>
+        <w:spacing w:after="80"/>
+      </w:pPr>
+      <w:r>
+        <w:t xml:space="preserve">  </w:t>
+      </w:r>
+      <w:r>
+        <w:rPr>
+          <w:b/>
+        </w:rPr>
+        <w:t>Tier 3: Cross-Feature Integration (4 tests)</w:t>
+      </w:r>
+      <w:r>
+        <w:t xml:space="preserve">: Tests the coupled execution of the student model, neural refiner, and speculative sampler inside the </w:t>
+      </w:r>
+      <w:r>
+        <w:rPr>
+          <w:rFonts w:ascii="Courier New" w:hAnsi="Courier New"/>
+          <w:sz w:val="19"/>
+          <w:shd w:fill="f7fafc"/>
+        </w:rPr>
+        <w:t>AtomDiffusion.sample()</w:t>
+      </w:r>
+      <w:r>
+        <w:t xml:space="preserve"> loop.</w:t>
+      </w:r>
+    </w:p>
+    <w:p>
+      <w:pPr>
+        <w:pStyle w:val="ListBullet"/>
+        <w:spacing w:after="80"/>
+      </w:pPr>
+      <w:r>
+        <w:t xml:space="preserve">  </w:t>
+      </w:r>
+      <w:r>
+        <w:rPr>
+          <w:b/>
+        </w:rPr>
+        <w:t>Tier 4: Real-World Biological Validation (5 tests)</w:t>
+      </w:r>
+      <w:r>
+        <w:t>: Verifies predictions on actual biological binders (Insulin, VEGFA) against predefined criteria.</w:t>
+      </w:r>
+    </w:p>
+    <w:p>
+      <w:pPr>
+        <w:jc w:val="both"/>
+      </w:pPr>
+      <w:r>
+        <w:t xml:space="preserve">The E2E test suite executes synchronously via </w:t>
+      </w:r>
+      <w:r>
+        <w:rPr>
+          <w:rFonts w:ascii="Courier New" w:hAnsi="Courier New"/>
+          <w:sz w:val="19"/>
+          <w:shd w:fill="f7fafc"/>
+        </w:rPr>
+        <w:t>run_e2e_tests.py</w:t>
+      </w:r>
+      <w:r>
+        <w:t>:</w:t>
+      </w:r>
+    </w:p>
+    <w:tbl>
+      <w:tblPr>
+        <w:tblW w:type="auto" w:w="0"/>
+        <w:jc w:val="center"/>
+        <w:tblLook w:firstColumn="1" w:firstRow="1" w:lastColumn="0" w:lastRow="0" w:noHBand="0" w:noVBand="1" w:val="04A0"/>
+        <w:tblBorders>
+          <w:top w:val="single" w:sz="4" w:space="0" w:color="e2e8f0"/>
+          <w:bottom w:val="single" w:sz="4" w:space="0" w:color="e2e8f0"/>
+          <w:left w:val="single" w:sz="8" w:space="0" w:color="3182ce"/>
+          <w:right w:val="single" w:sz="4" w:space="0" w:color="e2e8f0"/>
+        </w:tblBorders>
+      </w:tblPr>
+      <w:tblGrid>
+        <w:gridCol w:w="9029"/>
+      </w:tblGrid>
+      <w:tr>
+        <w:tc>
+          <w:tcPr>
+            <w:tcW w:type="dxa" w:w="9029"/>
+            <w:shd w:fill="f7fafc"/>
+            <w:tcMar>
+              <w:top w:w="150" w:type="dxa"/>
+              <w:bottom w:w="150" w:type="dxa"/>
+              <w:left w:w="200" w:type="dxa"/>
+              <w:right w:w="200" w:type="dxa"/>
+            </w:tcMar>
+          </w:tcPr>
+          <w:p>
+            <w:pPr>
+              <w:spacing w:line="240" w:lineRule="auto" w:after="0"/>
+            </w:pPr>
+            <w:r>
+              <w:rPr>
+                <w:rFonts w:ascii="Courier New" w:hAnsi="Courier New"/>
+                <w:color w:val="2D3748"/>
+                <w:sz w:val="17"/>
+              </w:rPr>
+              <w:t>======================================================================</w:t>
+              <w:br/>
+              <w:t xml:space="preserve">                Executing Biomolecular Design E2E Test Suite          </w:t>
+              <w:br/>
+              <w:t>======================================================================</w:t>
+              <w:br/>
+              <w:t>...</w:t>
+              <w:br/>
+              <w:t>======================== 53 passed, 1 warning in 4.96s =========================</w:t>
+              <w:br/>
+              <w:br/>
+              <w:t xml:space="preserve">          SUCCESS: All 53 test cases in the E2E suite passed!         </w:t>
+              <w:br/>
+              <w:t>======================================================================</w:t>
+            </w:r>
+          </w:p>
+        </w:tc>
+      </w:tr>
+    </w:tbl>
+    <w:p/>
+    <w:p>
+      <w:pPr>
+        <w:pStyle w:val="Heading4"/>
+        <w:keepNext/>
+        <w:spacing w:before="200" w:after="80"/>
+      </w:pPr>
+      <w:r>
+        <w:rPr>
+          <w:rFonts w:ascii="Times New Roman" w:hAnsi="Times New Roman"/>
+          <w:b/>
+          <w:color w:val="2C5282"/>
+          <w:sz w:val="22"/>
+        </w:rPr>
+        <w:t>Figure 5: Post-Diffusion Neural Coordinate Refinement Comparison</w:t>
+      </w:r>
+    </w:p>
+    <w:p>
+      <w:pPr>
+        <w:spacing w:before="240" w:after="80"/>
+        <w:jc w:val="center"/>
+      </w:pPr>
+      <w:r>
+        <w:drawing>
+          <wp:inline xmlns:a="http://schemas.openxmlformats.org/drawingml/2006/main" xmlns:pic="http://schemas.openxmlformats.org/drawingml/2006/picture">
+            <wp:extent cx="4114800" cy="3429000"/>
+            <wp:docPr id="5" name="Picture 5"/>
+            <wp:cNvGraphicFramePr>
+              <a:graphicFrameLocks noChangeAspect="1"/>
+            </wp:cNvGraphicFramePr>
+            <a:graphic>
+              <a:graphicData uri="http://schemas.openxmlformats.org/drawingml/2006/picture">
+                <pic:pic>
+                  <pic:nvPicPr>
+                    <pic:cNvPr id="0" name="backbone_3d_refinement.png"/>
+                    <pic:cNvPicPr/>
+                  </pic:nvPicPr>
+                  <pic:blipFill>
+                    <a:blip r:embed="rId13"/>
+                    <a:stretch>
+                      <a:fillRect/>
+                    </a:stretch>
+                  </pic:blipFill>
+                  <pic:spPr>
+                    <a:xfrm>
+                      <a:off x="0" y="0"/>
+                      <a:ext cx="4114800" cy="3429000"/>
+                    </a:xfrm>
+                    <a:prstGeom prst="rect"/>
+                  </pic:spPr>
+                </pic:pic>
+              </a:graphicData>
+            </a:graphic>
+          </wp:inline>
+        </w:drawing>
+      </w:r>
+    </w:p>
+    <w:p>
+      <w:pPr>
+        <w:spacing w:after="240"/>
+        <w:jc w:val="center"/>
+      </w:pPr>
+      <w:r>
+        <w:rPr>
+          <w:i/>
+          <w:color w:val="4A5568"/>
+          <w:sz w:val="19"/>
+        </w:rPr>
+        <w:t>Figure: Post-Diffusion Neural Coordinate Refinement Comparison</w:t>
+      </w:r>
+    </w:p>
+    <w:p>
+      <w:pPr>
+        <w:jc w:val="both"/>
+      </w:pPr>
+      <w:r>
+        <w:t>The coordinate refiner successfully resolved simulated clashes (Figure 5, right) and adjusted C-alpha bond lengths to $\le 1.0$ Å deviation from the target value.</w:t>
+      </w:r>
+    </w:p>
+    <w:p>
+      <w:r>
+        <w:br w:type="page"/>
+      </w:r>
+    </w:p>
+    <w:p>
+      <w:pPr>
+        <w:pStyle w:val="Heading1"/>
+        <w:keepNext/>
+        <w:spacing w:before="360" w:after="160"/>
+      </w:pPr>
+      <w:r>
+        <w:rPr>
+          <w:rFonts w:ascii="Times New Roman" w:hAnsi="Times New Roman"/>
+          <w:b/>
+          <w:color w:val="0C2340"/>
+          <w:sz w:val="36"/>
+        </w:rPr>
+        <w:t>6. FUTURE PLAN</w:t>
       </w:r>
     </w:p>
     <w:tbl>
@@ -5425,7 +6284,7 @@
               <w:rPr>
                 <w:sz w:val="18"/>
               </w:rPr>
-              <w:t>Production GPU Scaling</w:t>
+              <w:t>Edge Optimization &amp; Integration</w:t>
             </w:r>
           </w:p>
         </w:tc>
@@ -5445,7 +6304,7 @@
               <w:rPr>
                 <w:sz w:val="18"/>
               </w:rPr>
-              <w:t>11 Jun 2026 – 20 Jul 2026</w:t>
+              <w:t>11 Jun 2026 – 22 Jun 2026</w:t>
             </w:r>
           </w:p>
         </w:tc>
@@ -5465,7 +6324,7 @@
               <w:rPr>
                 <w:sz w:val="18"/>
               </w:rPr>
-              <w:t>Deploy on CUDA and run NCCL scale tests</w:t>
+              <w:t>Integrate Low-Rank, CFG student, and Neural Refiner; resolve MPS dependencies</w:t>
             </w:r>
           </w:p>
         </w:tc>
@@ -5485,7 +6344,7 @@
               <w:rPr>
                 <w:sz w:val="18"/>
               </w:rPr>
-              <w:t>PENDING</w:t>
+              <w:t>COMPLETED</w:t>
             </w:r>
           </w:p>
         </w:tc>
@@ -5525,6 +6384,105 @@
               <w:rPr>
                 <w:sz w:val="18"/>
               </w:rPr>
+              <w:t>Production GPU Scaling</w:t>
+            </w:r>
+          </w:p>
+        </w:tc>
+        <w:tc>
+          <w:tcPr>
+            <w:tcW w:type="dxa" w:w="1806"/>
+            <w:tcMar>
+              <w:top w:w="100" w:type="dxa"/>
+              <w:bottom w:w="100" w:type="dxa"/>
+              <w:left w:w="120" w:type="dxa"/>
+              <w:right w:w="120" w:type="dxa"/>
+            </w:tcMar>
+          </w:tcPr>
+          <w:p>
+            <w:r>
+              <w:rPr>
+                <w:sz w:val="18"/>
+              </w:rPr>
+              <w:t>23 Jun 2026 – 20 Jul 2026</w:t>
+            </w:r>
+          </w:p>
+        </w:tc>
+        <w:tc>
+          <w:tcPr>
+            <w:tcW w:type="dxa" w:w="1806"/>
+            <w:tcMar>
+              <w:top w:w="100" w:type="dxa"/>
+              <w:bottom w:w="100" w:type="dxa"/>
+              <w:left w:w="120" w:type="dxa"/>
+              <w:right w:w="120" w:type="dxa"/>
+            </w:tcMar>
+          </w:tcPr>
+          <w:p>
+            <w:r>
+              <w:rPr>
+                <w:sz w:val="18"/>
+              </w:rPr>
+              <w:t>Deploy on CUDA and run NCCL scale tests</w:t>
+            </w:r>
+          </w:p>
+        </w:tc>
+        <w:tc>
+          <w:tcPr>
+            <w:tcW w:type="dxa" w:w="1806"/>
+            <w:tcMar>
+              <w:top w:w="100" w:type="dxa"/>
+              <w:bottom w:w="100" w:type="dxa"/>
+              <w:left w:w="120" w:type="dxa"/>
+              <w:right w:w="120" w:type="dxa"/>
+            </w:tcMar>
+          </w:tcPr>
+          <w:p>
+            <w:r>
+              <w:rPr>
+                <w:sz w:val="18"/>
+              </w:rPr>
+              <w:t>PENDING</w:t>
+            </w:r>
+          </w:p>
+        </w:tc>
+      </w:tr>
+      <w:tr>
+        <w:tc>
+          <w:tcPr>
+            <w:tcW w:type="dxa" w:w="1806"/>
+            <w:tcMar>
+              <w:top w:w="100" w:type="dxa"/>
+              <w:bottom w:w="100" w:type="dxa"/>
+              <w:left w:w="120" w:type="dxa"/>
+              <w:right w:w="120" w:type="dxa"/>
+            </w:tcMar>
+            <w:shd w:fill="f7fafc"/>
+          </w:tcPr>
+          <w:p>
+            <w:r>
+              <w:rPr>
+                <w:sz w:val="18"/>
+              </w:rPr>
+              <w:t>6</w:t>
+            </w:r>
+          </w:p>
+        </w:tc>
+        <w:tc>
+          <w:tcPr>
+            <w:tcW w:type="dxa" w:w="1806"/>
+            <w:tcMar>
+              <w:top w:w="100" w:type="dxa"/>
+              <w:bottom w:w="100" w:type="dxa"/>
+              <w:left w:w="120" w:type="dxa"/>
+              <w:right w:w="120" w:type="dxa"/>
+            </w:tcMar>
+            <w:shd w:fill="f7fafc"/>
+          </w:tcPr>
+          <w:p>
+            <w:r>
+              <w:rPr>
+                <w:sz w:val="18"/>
+              </w:rPr>
               <w:t>Binder Design Screens &amp; Thesis</w:t>
             </w:r>
           </w:p>
@@ -5538,6 +6496,7 @@
               <w:left w:w="120" w:type="dxa"/>
               <w:right w:w="120" w:type="dxa"/>
             </w:tcMar>
+            <w:shd w:fill="f7fafc"/>
           </w:tcPr>
           <w:p>
             <w:r>
@@ -5557,6 +6516,7 @@
               <w:left w:w="120" w:type="dxa"/>
               <w:right w:w="120" w:type="dxa"/>
             </w:tcMar>
+            <w:shd w:fill="f7fafc"/>
           </w:tcPr>
           <w:p>
             <w:r>
@@ -5576,6 +6536,7 @@
               <w:left w:w="120" w:type="dxa"/>
               <w:right w:w="120" w:type="dxa"/>
             </w:tcMar>
+            <w:shd w:fill="f7fafc"/>
           </w:tcPr>
           <w:p>
             <w:r>
@@ -5602,7 +6563,7 @@
           <w:color w:val="0C2340"/>
           <w:sz w:val="36"/>
         </w:rPr>
-        <w:t>6. ABBREVIATIONS</w:t>
+        <w:t>7. ABBREVIATIONS</w:t>
       </w:r>
     </w:p>
     <w:tbl>
@@ -5813,7 +6774,7 @@
               <w:rPr>
                 <w:sz w:val="18"/>
               </w:rPr>
-              <w:t>DPO</w:t>
+              <w:t>OPM</w:t>
             </w:r>
           </w:p>
         </w:tc>
@@ -5833,7 +6794,7 @@
               <w:rPr>
                 <w:sz w:val="18"/>
               </w:rPr>
-              <w:t>Direct Preference Optimization</w:t>
+              <w:t>Outer Product Mean</w:t>
             </w:r>
           </w:p>
         </w:tc>
@@ -5854,7 +6815,7 @@
               <w:rPr>
                 <w:sz w:val="18"/>
               </w:rPr>
-              <w:t>SimPO</w:t>
+              <w:t>CFG</w:t>
             </w:r>
           </w:p>
         </w:tc>
@@ -5873,7 +6834,7 @@
               <w:rPr>
                 <w:sz w:val="18"/>
               </w:rPr>
-              <w:t>Simple Preference Optimization</w:t>
+              <w:t>Classifier-Free Guidance</w:t>
             </w:r>
           </w:p>
         </w:tc>
@@ -5895,6 +6856,129 @@
               <w:rPr>
                 <w:sz w:val="18"/>
               </w:rPr>
+              <w:t>MLP</w:t>
+            </w:r>
+          </w:p>
+        </w:tc>
+        <w:tc>
+          <w:tcPr>
+            <w:tcW w:type="dxa" w:w="4514"/>
+            <w:tcMar>
+              <w:top w:w="100" w:type="dxa"/>
+              <w:bottom w:w="100" w:type="dxa"/>
+              <w:left w:w="120" w:type="dxa"/>
+              <w:right w:w="120" w:type="dxa"/>
+            </w:tcMar>
+            <w:shd w:fill="f7fafc"/>
+          </w:tcPr>
+          <w:p>
+            <w:r>
+              <w:rPr>
+                <w:sz w:val="18"/>
+              </w:rPr>
+              <w:t>Multi-Layer Perceptron</w:t>
+            </w:r>
+          </w:p>
+        </w:tc>
+      </w:tr>
+      <w:tr>
+        <w:tc>
+          <w:tcPr>
+            <w:tcW w:type="dxa" w:w="4514"/>
+            <w:tcMar>
+              <w:top w:w="100" w:type="dxa"/>
+              <w:bottom w:w="100" w:type="dxa"/>
+              <w:left w:w="120" w:type="dxa"/>
+              <w:right w:w="120" w:type="dxa"/>
+            </w:tcMar>
+          </w:tcPr>
+          <w:p>
+            <w:r>
+              <w:rPr>
+                <w:sz w:val="18"/>
+              </w:rPr>
+              <w:t>ANE</w:t>
+            </w:r>
+          </w:p>
+        </w:tc>
+        <w:tc>
+          <w:tcPr>
+            <w:tcW w:type="dxa" w:w="4514"/>
+            <w:tcMar>
+              <w:top w:w="100" w:type="dxa"/>
+              <w:bottom w:w="100" w:type="dxa"/>
+              <w:left w:w="120" w:type="dxa"/>
+              <w:right w:w="120" w:type="dxa"/>
+            </w:tcMar>
+          </w:tcPr>
+          <w:p>
+            <w:r>
+              <w:rPr>
+                <w:sz w:val="18"/>
+              </w:rPr>
+              <w:t>Apple Neural Engine</w:t>
+            </w:r>
+          </w:p>
+        </w:tc>
+      </w:tr>
+      <w:tr>
+        <w:tc>
+          <w:tcPr>
+            <w:tcW w:type="dxa" w:w="4514"/>
+            <w:tcMar>
+              <w:top w:w="100" w:type="dxa"/>
+              <w:bottom w:w="100" w:type="dxa"/>
+              <w:left w:w="120" w:type="dxa"/>
+              <w:right w:w="120" w:type="dxa"/>
+            </w:tcMar>
+            <w:shd w:fill="f7fafc"/>
+          </w:tcPr>
+          <w:p>
+            <w:r>
+              <w:rPr>
+                <w:sz w:val="18"/>
+              </w:rPr>
+              <w:t>MPS</w:t>
+            </w:r>
+          </w:p>
+        </w:tc>
+        <w:tc>
+          <w:tcPr>
+            <w:tcW w:type="dxa" w:w="4514"/>
+            <w:tcMar>
+              <w:top w:w="100" w:type="dxa"/>
+              <w:bottom w:w="100" w:type="dxa"/>
+              <w:left w:w="120" w:type="dxa"/>
+              <w:right w:w="120" w:type="dxa"/>
+            </w:tcMar>
+            <w:shd w:fill="f7fafc"/>
+          </w:tcPr>
+          <w:p>
+            <w:r>
+              <w:rPr>
+                <w:sz w:val="18"/>
+              </w:rPr>
+              <w:t>Metal Performance Shaders</w:t>
+            </w:r>
+          </w:p>
+        </w:tc>
+      </w:tr>
+      <w:tr>
+        <w:tc>
+          <w:tcPr>
+            <w:tcW w:type="dxa" w:w="4514"/>
+            <w:tcMar>
+              <w:top w:w="100" w:type="dxa"/>
+              <w:bottom w:w="100" w:type="dxa"/>
+              <w:left w:w="120" w:type="dxa"/>
+              <w:right w:w="120" w:type="dxa"/>
+            </w:tcMar>
+          </w:tcPr>
+          <w:p>
+            <w:r>
+              <w:rPr>
+                <w:sz w:val="18"/>
+              </w:rPr>
               <w:t>VRAM</w:t>
             </w:r>
           </w:p>
@@ -5908,7 +6992,6 @@
               <w:left w:w="120" w:type="dxa"/>
               <w:right w:w="120" w:type="dxa"/>
             </w:tcMar>
-            <w:shd w:fill="f7fafc"/>
           </w:tcPr>
           <w:p>
             <w:r>
@@ -5930,6 +7013,7 @@
               <w:left w:w="120" w:type="dxa"/>
               <w:right w:w="120" w:type="dxa"/>
             </w:tcMar>
+            <w:shd w:fill="f7fafc"/>
           </w:tcPr>
           <w:p>
             <w:r>
@@ -5949,6 +7033,7 @@
               <w:left w:w="120" w:type="dxa"/>
               <w:right w:w="120" w:type="dxa"/>
             </w:tcMar>
+            <w:shd w:fill="f7fafc"/>
           </w:tcPr>
           <w:p>
             <w:r>
@@ -5970,7 +7055,6 @@
               <w:left w:w="120" w:type="dxa"/>
               <w:right w:w="120" w:type="dxa"/>
             </w:tcMar>
-            <w:shd w:fill="f7fafc"/>
           </w:tcPr>
           <w:p>
             <w:r>
@@ -5990,7 +7074,6 @@
               <w:left w:w="120" w:type="dxa"/>
               <w:right w:w="120" w:type="dxa"/>
             </w:tcMar>
-            <w:shd w:fill="f7fafc"/>
           </w:tcPr>
           <w:p>
             <w:r>
@@ -6012,6 +7095,7 @@
               <w:left w:w="120" w:type="dxa"/>
               <w:right w:w="120" w:type="dxa"/>
             </w:tcMar>
+            <w:shd w:fill="f7fafc"/>
           </w:tcPr>
           <w:p>
             <w:r>
@@ -6031,6 +7115,7 @@
               <w:left w:w="120" w:type="dxa"/>
               <w:right w:w="120" w:type="dxa"/>
             </w:tcMar>
+            <w:shd w:fill="f7fafc"/>
           </w:tcPr>
           <w:p>
             <w:r>
@@ -6052,7 +7137,6 @@
               <w:left w:w="120" w:type="dxa"/>
               <w:right w:w="120" w:type="dxa"/>
             </w:tcMar>
-            <w:shd w:fill="f7fafc"/>
           </w:tcPr>
           <w:p>
             <w:r>
@@ -6072,7 +7156,6 @@
               <w:left w:w="120" w:type="dxa"/>
               <w:right w:w="120" w:type="dxa"/>
             </w:tcMar>
-            <w:shd w:fill="f7fafc"/>
           </w:tcPr>
           <w:p>
             <w:r>
@@ -6094,6 +7177,7 @@
               <w:left w:w="120" w:type="dxa"/>
               <w:right w:w="120" w:type="dxa"/>
             </w:tcMar>
+            <w:shd w:fill="f7fafc"/>
           </w:tcPr>
           <w:p>
             <w:r>
@@ -6113,6 +7197,7 @@
               <w:left w:w="120" w:type="dxa"/>
               <w:right w:w="120" w:type="dxa"/>
             </w:tcMar>
+            <w:shd w:fill="f7fafc"/>
           </w:tcPr>
           <w:p>
             <w:r>
@@ -6134,7 +7219,6 @@
               <w:left w:w="120" w:type="dxa"/>
               <w:right w:w="120" w:type="dxa"/>
             </w:tcMar>
-            <w:shd w:fill="f7fafc"/>
           </w:tcPr>
           <w:p>
             <w:r>
@@ -6154,6 +7238,27 @@
               <w:left w:w="120" w:type="dxa"/>
               <w:right w:w="120" w:type="dxa"/>
             </w:tcMar>
+          </w:tcPr>
+          <w:p>
+            <w:r>
+              <w:rPr>
+                <w:sz w:val="18"/>
+              </w:rPr>
+              <w:t>Root Mean Square Deviation</w:t>
+            </w:r>
+          </w:p>
+        </w:tc>
+      </w:tr>
+      <w:tr>
+        <w:tc>
+          <w:tcPr>
+            <w:tcW w:type="dxa" w:w="4514"/>
+            <w:tcMar>
+              <w:top w:w="100" w:type="dxa"/>
+              <w:bottom w:w="100" w:type="dxa"/>
+              <w:left w:w="120" w:type="dxa"/>
+              <w:right w:w="120" w:type="dxa"/>
+            </w:tcMar>
             <w:shd w:fill="f7fafc"/>
           </w:tcPr>
           <w:p>
@@ -6161,7 +7266,27 @@
               <w:rPr>
                 <w:sz w:val="18"/>
               </w:rPr>
-              <w:t>Root Mean Square Deviation</w:t>
+              <w:t>OOM</w:t>
+            </w:r>
+          </w:p>
+        </w:tc>
+        <w:tc>
+          <w:tcPr>
+            <w:tcW w:type="dxa" w:w="4514"/>
+            <w:tcMar>
+              <w:top w:w="100" w:type="dxa"/>
+              <w:bottom w:w="100" w:type="dxa"/>
+              <w:left w:w="120" w:type="dxa"/>
+              <w:right w:w="120" w:type="dxa"/>
+            </w:tcMar>
+            <w:shd w:fill="f7fafc"/>
+          </w:tcPr>
+          <w:p>
+            <w:r>
+              <w:rPr>
+                <w:sz w:val="18"/>
+              </w:rPr>
+              <w:t>Out Of Memory</w:t>
             </w:r>
           </w:p>
         </w:tc>

</xml_diff>